<commit_message>
feat: complete workshop 05 deliverables, report and evidences for MPT
</commit_message>
<xml_diff>
--- a/SI886-S05-TALLER-Grupo01.docx
+++ b/SI886-S05-TALLER-Grupo01.docx
@@ -219,27 +219,9 @@
         <w:rPr>
           <w:rFonts w:ascii="Calibri" w:hAnsi="Calibri"/>
           <w:b/>
-          <w:sz w:val="19"/>
-        </w:rPr>
-        <w:t>CALIZAYA FLORES, KEVIN ALEXANDER · 2021070123</w:t>
-      </w:r>
-      <w:r>
-        <w:rPr>
-          <w:rFonts w:ascii="Calibri" w:hAnsi="Calibri"/>
-          <w:b/>
-          <w:sz w:val="19"/>
-        </w:rPr>
-        <w:br/>
-        <w:t>MAMANI CHOQUE, RODRIGO ALONSO · 2021070456</w:t>
-      </w:r>
-      <w:r>
-        <w:rPr>
-          <w:rFonts w:ascii="Calibri" w:hAnsi="Calibri"/>
-          <w:b/>
-          <w:sz w:val="19"/>
-        </w:rPr>
-        <w:br/>
-        <w:t>QUISPE TICONA, MARCO ANTONIO · 2021070789</w:t>
+          <w:sz w:val="21"/>
+        </w:rPr>
+        <w:t>AROCUTIPA AROCUTIPA, GIANFRANCO · CÓDIGO: 2023076790</w:t>
       </w:r>
     </w:p>
     <w:p>
@@ -360,7 +342,7 @@
       <w:pPr>
         <w:pStyle w:val="Ttulo1"/>
       </w:pPr>
-      <w:bookmarkStart w:id="0" w:name="_Toc240736109"/>
+      <w:bookmarkStart w:id="0" w:name="_Toc240737903"/>
       <w:r>
         <w:lastRenderedPageBreak/>
         <w:t>Índice</w:t>
@@ -388,7 +370,7 @@
       <w:r>
         <w:fldChar w:fldCharType="separate"/>
       </w:r>
-      <w:hyperlink w:anchor="_Toc240736109" w:history="1">
+      <w:hyperlink w:anchor="_Toc240737903" w:history="1">
         <w:r>
           <w:rPr>
             <w:rStyle w:val="Hipervnculo"/>
@@ -415,7 +397,7 @@
             <w:noProof/>
             <w:webHidden/>
           </w:rPr>
-          <w:instrText xml:space="preserve"> PAGEREF _Toc240736109 \h </w:instrText>
+          <w:instrText xml:space="preserve"> PAGEREF _Toc240737903 \h </w:instrText>
         </w:r>
         <w:r>
           <w:rPr>
@@ -458,7 +440,7 @@
           <w:lang w:val="es-PE" w:eastAsia="es-PE"/>
         </w:rPr>
       </w:pPr>
-      <w:hyperlink w:anchor="_Toc240736110" w:history="1">
+      <w:hyperlink w:anchor="_Toc240737904" w:history="1">
         <w:r>
           <w:rPr>
             <w:rStyle w:val="Hipervnculo"/>
@@ -485,7 +467,7 @@
             <w:noProof/>
             <w:webHidden/>
           </w:rPr>
-          <w:instrText xml:space="preserve"> PAGEREF _Toc240736110 \h </w:instrText>
+          <w:instrText xml:space="preserve"> PAGEREF _Toc240737904 \h </w:instrText>
         </w:r>
         <w:r>
           <w:rPr>
@@ -528,7 +510,7 @@
           <w:lang w:val="es-PE" w:eastAsia="es-PE"/>
         </w:rPr>
       </w:pPr>
-      <w:hyperlink w:anchor="_Toc240736111" w:history="1">
+      <w:hyperlink w:anchor="_Toc240737905" w:history="1">
         <w:r>
           <w:rPr>
             <w:rStyle w:val="Hipervnculo"/>
@@ -555,7 +537,7 @@
             <w:noProof/>
             <w:webHidden/>
           </w:rPr>
-          <w:instrText xml:space="preserve"> PAGEREF _Toc240736111 \h </w:instrText>
+          <w:instrText xml:space="preserve"> PAGEREF _Toc240737905 \h </w:instrText>
         </w:r>
         <w:r>
           <w:rPr>
@@ -598,7 +580,7 @@
           <w:lang w:val="es-PE" w:eastAsia="es-PE"/>
         </w:rPr>
       </w:pPr>
-      <w:hyperlink w:anchor="_Toc240736112" w:history="1">
+      <w:hyperlink w:anchor="_Toc240737906" w:history="1">
         <w:r>
           <w:rPr>
             <w:rStyle w:val="Hipervnculo"/>
@@ -625,7 +607,7 @@
             <w:noProof/>
             <w:webHidden/>
           </w:rPr>
-          <w:instrText xml:space="preserve"> PAGEREF _Toc240736112 \h </w:instrText>
+          <w:instrText xml:space="preserve"> PAGEREF _Toc240737906 \h </w:instrText>
         </w:r>
         <w:r>
           <w:rPr>
@@ -668,7 +650,7 @@
           <w:lang w:val="es-PE" w:eastAsia="es-PE"/>
         </w:rPr>
       </w:pPr>
-      <w:hyperlink w:anchor="_Toc240736113" w:history="1">
+      <w:hyperlink w:anchor="_Toc240737907" w:history="1">
         <w:r>
           <w:rPr>
             <w:rStyle w:val="Hipervnculo"/>
@@ -695,7 +677,7 @@
             <w:noProof/>
             <w:webHidden/>
           </w:rPr>
-          <w:instrText xml:space="preserve"> PAGEREF _Toc240736113 \h </w:instrText>
+          <w:instrText xml:space="preserve"> PAGEREF _Toc240737907 \h </w:instrText>
         </w:r>
         <w:r>
           <w:rPr>
@@ -738,7 +720,7 @@
           <w:lang w:val="es-PE" w:eastAsia="es-PE"/>
         </w:rPr>
       </w:pPr>
-      <w:hyperlink w:anchor="_Toc240736114" w:history="1">
+      <w:hyperlink w:anchor="_Toc240737908" w:history="1">
         <w:r>
           <w:rPr>
             <w:rStyle w:val="Hipervnculo"/>
@@ -765,7 +747,7 @@
             <w:noProof/>
             <w:webHidden/>
           </w:rPr>
-          <w:instrText xml:space="preserve"> PAGEREF _Toc240736114 \h </w:instrText>
+          <w:instrText xml:space="preserve"> PAGEREF _Toc240737908 \h </w:instrText>
         </w:r>
         <w:r>
           <w:rPr>
@@ -808,7 +790,7 @@
           <w:lang w:val="es-PE" w:eastAsia="es-PE"/>
         </w:rPr>
       </w:pPr>
-      <w:hyperlink w:anchor="_Toc240736115" w:history="1">
+      <w:hyperlink w:anchor="_Toc240737909" w:history="1">
         <w:r>
           <w:rPr>
             <w:rStyle w:val="Hipervnculo"/>
@@ -835,7 +817,7 @@
             <w:noProof/>
             <w:webHidden/>
           </w:rPr>
-          <w:instrText xml:space="preserve"> PAGEREF _Toc240736115 \h </w:instrText>
+          <w:instrText xml:space="preserve"> PAGEREF _Toc240737909 \h </w:instrText>
         </w:r>
         <w:r>
           <w:rPr>
@@ -878,7 +860,7 @@
           <w:lang w:val="es-PE" w:eastAsia="es-PE"/>
         </w:rPr>
       </w:pPr>
-      <w:hyperlink w:anchor="_Toc240736116" w:history="1">
+      <w:hyperlink w:anchor="_Toc240737910" w:history="1">
         <w:r>
           <w:rPr>
             <w:rStyle w:val="Hipervnculo"/>
@@ -905,7 +887,7 @@
             <w:noProof/>
             <w:webHidden/>
           </w:rPr>
-          <w:instrText xml:space="preserve"> PAGEREF _Toc240736116 \h </w:instrText>
+          <w:instrText xml:space="preserve"> PAGEREF _Toc240737910 \h </w:instrText>
         </w:r>
         <w:r>
           <w:rPr>
@@ -948,7 +930,7 @@
           <w:lang w:val="es-PE" w:eastAsia="es-PE"/>
         </w:rPr>
       </w:pPr>
-      <w:hyperlink w:anchor="_Toc240736117" w:history="1">
+      <w:hyperlink w:anchor="_Toc240737911" w:history="1">
         <w:r>
           <w:rPr>
             <w:rStyle w:val="Hipervnculo"/>
@@ -975,7 +957,7 @@
             <w:noProof/>
             <w:webHidden/>
           </w:rPr>
-          <w:instrText xml:space="preserve"> PAGEREF _Toc240736117 \h </w:instrText>
+          <w:instrText xml:space="preserve"> PAGEREF _Toc240737911 \h </w:instrText>
         </w:r>
         <w:r>
           <w:rPr>
@@ -1018,7 +1000,7 @@
           <w:lang w:val="es-PE" w:eastAsia="es-PE"/>
         </w:rPr>
       </w:pPr>
-      <w:hyperlink w:anchor="_Toc240736118" w:history="1">
+      <w:hyperlink w:anchor="_Toc240737912" w:history="1">
         <w:r>
           <w:rPr>
             <w:rStyle w:val="Hipervnculo"/>
@@ -1045,7 +1027,7 @@
             <w:noProof/>
             <w:webHidden/>
           </w:rPr>
-          <w:instrText xml:space="preserve"> PAGEREF _Toc240736118 \h </w:instrText>
+          <w:instrText xml:space="preserve"> PAGEREF _Toc240737912 \h </w:instrText>
         </w:r>
         <w:r>
           <w:rPr>
@@ -1065,7 +1047,7 @@
             <w:noProof/>
             <w:webHidden/>
           </w:rPr>
-          <w:t>5</w:t>
+          <w:t>4</w:t>
         </w:r>
         <w:r>
           <w:rPr>
@@ -1088,7 +1070,7 @@
           <w:lang w:val="es-PE" w:eastAsia="es-PE"/>
         </w:rPr>
       </w:pPr>
-      <w:hyperlink w:anchor="_Toc240736119" w:history="1">
+      <w:hyperlink w:anchor="_Toc240737913" w:history="1">
         <w:r>
           <w:rPr>
             <w:rStyle w:val="Hipervnculo"/>
@@ -1116,7 +1098,7 @@
             <w:noProof/>
             <w:webHidden/>
           </w:rPr>
-          <w:instrText xml:space="preserve"> PAGEREF _Toc240736119 \h </w:instrText>
+          <w:instrText xml:space="preserve"> PAGEREF _Toc240737913 \h </w:instrText>
         </w:r>
         <w:r>
           <w:rPr>
@@ -1159,7 +1141,7 @@
           <w:lang w:val="es-PE" w:eastAsia="es-PE"/>
         </w:rPr>
       </w:pPr>
-      <w:hyperlink w:anchor="_Toc240736120" w:history="1">
+      <w:hyperlink w:anchor="_Toc240737914" w:history="1">
         <w:r>
           <w:rPr>
             <w:rStyle w:val="Hipervnculo"/>
@@ -1187,7 +1169,7 @@
             <w:noProof/>
             <w:webHidden/>
           </w:rPr>
-          <w:instrText xml:space="preserve"> PAGEREF _Toc240736120 \h </w:instrText>
+          <w:instrText xml:space="preserve"> PAGEREF _Toc240737914 \h </w:instrText>
         </w:r>
         <w:r>
           <w:rPr>
@@ -1230,7 +1212,7 @@
           <w:lang w:val="es-PE" w:eastAsia="es-PE"/>
         </w:rPr>
       </w:pPr>
-      <w:hyperlink w:anchor="_Toc240736121" w:history="1">
+      <w:hyperlink w:anchor="_Toc240737915" w:history="1">
         <w:r>
           <w:rPr>
             <w:rStyle w:val="Hipervnculo"/>
@@ -1258,7 +1240,7 @@
             <w:noProof/>
             <w:webHidden/>
           </w:rPr>
-          <w:instrText xml:space="preserve"> PAGEREF _Toc240736121 \h </w:instrText>
+          <w:instrText xml:space="preserve"> PAGEREF _Toc240737915 \h </w:instrText>
         </w:r>
         <w:r>
           <w:rPr>
@@ -1301,7 +1283,7 @@
           <w:lang w:val="es-PE" w:eastAsia="es-PE"/>
         </w:rPr>
       </w:pPr>
-      <w:hyperlink w:anchor="_Toc240736122" w:history="1">
+      <w:hyperlink w:anchor="_Toc240737916" w:history="1">
         <w:r>
           <w:rPr>
             <w:rStyle w:val="Hipervnculo"/>
@@ -1329,7 +1311,7 @@
             <w:noProof/>
             <w:webHidden/>
           </w:rPr>
-          <w:instrText xml:space="preserve"> PAGEREF _Toc240736122 \h </w:instrText>
+          <w:instrText xml:space="preserve"> PAGEREF _Toc240737916 \h </w:instrText>
         </w:r>
         <w:r>
           <w:rPr>
@@ -1349,7 +1331,7 @@
             <w:noProof/>
             <w:webHidden/>
           </w:rPr>
-          <w:t>6</w:t>
+          <w:t>5</w:t>
         </w:r>
         <w:r>
           <w:rPr>
@@ -1372,7 +1354,7 @@
           <w:lang w:val="es-PE" w:eastAsia="es-PE"/>
         </w:rPr>
       </w:pPr>
-      <w:hyperlink w:anchor="_Toc240736123" w:history="1">
+      <w:hyperlink w:anchor="_Toc240737917" w:history="1">
         <w:r>
           <w:rPr>
             <w:rStyle w:val="Hipervnculo"/>
@@ -1400,7 +1382,7 @@
             <w:noProof/>
             <w:webHidden/>
           </w:rPr>
-          <w:instrText xml:space="preserve"> PAGEREF _Toc240736123 \h </w:instrText>
+          <w:instrText xml:space="preserve"> PAGEREF _Toc240737917 \h </w:instrText>
         </w:r>
         <w:r>
           <w:rPr>
@@ -1443,7 +1425,7 @@
           <w:lang w:val="es-PE" w:eastAsia="es-PE"/>
         </w:rPr>
       </w:pPr>
-      <w:hyperlink w:anchor="_Toc240736124" w:history="1">
+      <w:hyperlink w:anchor="_Toc240737918" w:history="1">
         <w:r>
           <w:rPr>
             <w:rStyle w:val="Hipervnculo"/>
@@ -1471,7 +1453,7 @@
             <w:noProof/>
             <w:webHidden/>
           </w:rPr>
-          <w:instrText xml:space="preserve"> PAGEREF _Toc240736124 \h </w:instrText>
+          <w:instrText xml:space="preserve"> PAGEREF _Toc240737918 \h </w:instrText>
         </w:r>
         <w:r>
           <w:rPr>
@@ -1514,7 +1496,7 @@
           <w:lang w:val="es-PE" w:eastAsia="es-PE"/>
         </w:rPr>
       </w:pPr>
-      <w:hyperlink w:anchor="_Toc240736125" w:history="1">
+      <w:hyperlink w:anchor="_Toc240737919" w:history="1">
         <w:r>
           <w:rPr>
             <w:rStyle w:val="Hipervnculo"/>
@@ -1541,7 +1523,7 @@
             <w:noProof/>
             <w:webHidden/>
           </w:rPr>
-          <w:instrText xml:space="preserve"> PAGEREF _Toc240736125 \h </w:instrText>
+          <w:instrText xml:space="preserve"> PAGEREF _Toc240737919 \h </w:instrText>
         </w:r>
         <w:r>
           <w:rPr>
@@ -1561,7 +1543,7 @@
             <w:noProof/>
             <w:webHidden/>
           </w:rPr>
-          <w:t>8</w:t>
+          <w:t>9</w:t>
         </w:r>
         <w:r>
           <w:rPr>
@@ -1584,7 +1566,7 @@
           <w:lang w:val="es-PE" w:eastAsia="es-PE"/>
         </w:rPr>
       </w:pPr>
-      <w:hyperlink w:anchor="_Toc240736126" w:history="1">
+      <w:hyperlink w:anchor="_Toc240737920" w:history="1">
         <w:r>
           <w:rPr>
             <w:rStyle w:val="Hipervnculo"/>
@@ -1611,7 +1593,7 @@
             <w:noProof/>
             <w:webHidden/>
           </w:rPr>
-          <w:instrText xml:space="preserve"> PAGEREF _Toc240736126 \h </w:instrText>
+          <w:instrText xml:space="preserve"> PAGEREF _Toc240737920 \h </w:instrText>
         </w:r>
         <w:r>
           <w:rPr>
@@ -1654,7 +1636,7 @@
           <w:lang w:val="es-PE" w:eastAsia="es-PE"/>
         </w:rPr>
       </w:pPr>
-      <w:hyperlink w:anchor="_Toc240736127" w:history="1">
+      <w:hyperlink w:anchor="_Toc240737921" w:history="1">
         <w:r>
           <w:rPr>
             <w:rStyle w:val="Hipervnculo"/>
@@ -1681,7 +1663,7 @@
             <w:noProof/>
             <w:webHidden/>
           </w:rPr>
-          <w:instrText xml:space="preserve"> PAGEREF _Toc240736127 \h </w:instrText>
+          <w:instrText xml:space="preserve"> PAGEREF _Toc240737921 \h </w:instrText>
         </w:r>
         <w:r>
           <w:rPr>
@@ -1724,7 +1706,7 @@
           <w:lang w:val="es-PE" w:eastAsia="es-PE"/>
         </w:rPr>
       </w:pPr>
-      <w:hyperlink w:anchor="_Toc240736128" w:history="1">
+      <w:hyperlink w:anchor="_Toc240737922" w:history="1">
         <w:r>
           <w:rPr>
             <w:rStyle w:val="Hipervnculo"/>
@@ -1751,7 +1733,7 @@
             <w:noProof/>
             <w:webHidden/>
           </w:rPr>
-          <w:instrText xml:space="preserve"> PAGEREF _Toc240736128 \h </w:instrText>
+          <w:instrText xml:space="preserve"> PAGEREF _Toc240737922 \h </w:instrText>
         </w:r>
         <w:r>
           <w:rPr>
@@ -1794,7 +1776,7 @@
           <w:lang w:val="es-PE" w:eastAsia="es-PE"/>
         </w:rPr>
       </w:pPr>
-      <w:hyperlink w:anchor="_Toc240736129" w:history="1">
+      <w:hyperlink w:anchor="_Toc240737923" w:history="1">
         <w:r>
           <w:rPr>
             <w:rStyle w:val="Hipervnculo"/>
@@ -1821,7 +1803,7 @@
             <w:noProof/>
             <w:webHidden/>
           </w:rPr>
-          <w:instrText xml:space="preserve"> PAGEREF _Toc240736129 \h </w:instrText>
+          <w:instrText xml:space="preserve"> PAGEREF _Toc240737923 \h </w:instrText>
         </w:r>
         <w:r>
           <w:rPr>
@@ -1867,7 +1849,7 @@
         <w:pStyle w:val="Ttulo1"/>
       </w:pPr>
       <w:bookmarkStart w:id="1" w:name="información-sobre-el-evento-práctico"/>
-      <w:bookmarkStart w:id="2" w:name="_Toc240736110"/>
+      <w:bookmarkStart w:id="2" w:name="_Toc240737904"/>
       <w:r>
         <w:lastRenderedPageBreak/>
         <w:t>1. Información sobre el evento práctico</w:t>
@@ -1879,7 +1861,7 @@
         <w:pStyle w:val="Ttulo2"/>
       </w:pPr>
       <w:bookmarkStart w:id="3" w:name="título-del-evento-práctico"/>
-      <w:bookmarkStart w:id="4" w:name="_Toc240736111"/>
+      <w:bookmarkStart w:id="4" w:name="_Toc240737905"/>
       <w:r>
         <w:t>1.1 Título del evento práctico</w:t>
       </w:r>
@@ -1894,14 +1876,14 @@
           <w:rFonts w:ascii="Calibri" w:hAnsi="Calibri"/>
           <w:sz w:val="19"/>
         </w:rPr>
-        <w:t xml:space="preserve">Taller de Laboratorio 05 · Diagnóstico de cultura con el Competing Values </w:t>
-      </w:r>
-      <w:r>
-        <w:rPr>
-          <w:rFonts w:ascii="Calibri" w:hAnsi="Calibri"/>
-          <w:sz w:val="19"/>
-        </w:rPr>
-        <w:t>Framework (Caso: Municipalidad Provincial de Tacna - MPT)</w:t>
+        <w:t>Taller de Laboratorio 05 · Diagnóstico de cu</w:t>
+      </w:r>
+      <w:r>
+        <w:rPr>
+          <w:rFonts w:ascii="Calibri" w:hAnsi="Calibri"/>
+          <w:sz w:val="19"/>
+        </w:rPr>
+        <w:t>ltura con el Competing Values Framework (Caso: Municipalidad Provincial de Tacna - MPT)</w:t>
       </w:r>
     </w:p>
     <w:p>
@@ -1909,7 +1891,7 @@
         <w:pStyle w:val="Ttulo2"/>
       </w:pPr>
       <w:bookmarkStart w:id="5" w:name="objetivos"/>
-      <w:bookmarkStart w:id="6" w:name="_Toc240736112"/>
+      <w:bookmarkStart w:id="6" w:name="_Toc240737906"/>
       <w:bookmarkEnd w:id="3"/>
       <w:r>
         <w:t>1.2 Objetivos</w:t>
@@ -1925,7 +1907,14 @@
           <w:rFonts w:ascii="Calibri" w:hAnsi="Calibri"/>
           <w:sz w:val="19"/>
         </w:rPr>
-        <w:t>• Aplicar un instrumento de diagnóstico de cultura basado en el Competing Values Framework (Cameron &amp; Quinn / OCAI) adaptado a la Municipalidad Provincial de Tacna.</w:t>
+        <w:t>• Aplicar un instrumento de diagnóstico de cultura basado en el Competing Values Framework (Cameron &amp; Quinn / OCAI) adaptado a la Municipalidad Provincial</w:t>
+      </w:r>
+      <w:r>
+        <w:rPr>
+          <w:rFonts w:ascii="Calibri" w:hAnsi="Calibri"/>
+          <w:sz w:val="19"/>
+        </w:rPr>
+        <w:t xml:space="preserve"> de Tacna.</w:t>
       </w:r>
     </w:p>
     <w:p>
@@ -1937,14 +1926,7 @@
           <w:rFonts w:ascii="Calibri" w:hAnsi="Calibri"/>
           <w:sz w:val="19"/>
         </w:rPr>
-        <w:t>• Determinar el per</w:t>
-      </w:r>
-      <w:r>
-        <w:rPr>
-          <w:rFonts w:ascii="Calibri" w:hAnsi="Calibri"/>
-          <w:sz w:val="19"/>
-        </w:rPr>
-        <w:t>fil de cultura actual y deseada a 5 años (2030) y calcular la brecha matemática neta por dimensión.</w:t>
+        <w:t>• Determinar el perfil de cultura actual y deseada a 5 años (2030) y calcular la brecha matemática neta por dimensión.</w:t>
       </w:r>
     </w:p>
     <w:p>
@@ -1956,14 +1938,14 @@
           <w:rFonts w:ascii="Calibri" w:hAnsi="Calibri"/>
           <w:sz w:val="19"/>
         </w:rPr>
-        <w:t>• Identificar los supuestos básicos subyacentes mediante el análisis hermenéutico de artefactos (ROF 2022, RISST 2024, PEI 2025-2030, Ley 27815) y de discur</w:t>
-      </w:r>
-      <w:r>
-        <w:rPr>
-          <w:rFonts w:ascii="Calibri" w:hAnsi="Calibri"/>
-          <w:sz w:val="19"/>
-        </w:rPr>
-        <w:t>so institucional.</w:t>
+        <w:t>• Identificar los supuestos básicos subyacentes mediante el análisis hermenéutico de artefactos (ROF 2022, RISST 2024, PEI 202</w:t>
+      </w:r>
+      <w:r>
+        <w:rPr>
+          <w:rFonts w:ascii="Calibri" w:hAnsi="Calibri"/>
+          <w:sz w:val="19"/>
+        </w:rPr>
+        <w:t>5-2030, Ley 27815) y de discurso institucional.</w:t>
       </w:r>
     </w:p>
     <w:p>
@@ -1987,14 +1969,14 @@
           <w:rFonts w:ascii="Calibri" w:hAnsi="Calibri"/>
           <w:sz w:val="19"/>
         </w:rPr>
-        <w:t xml:space="preserve">• Derivar las implicancias del perfil cultural para condicionar la hoja de ruta y la estrategia de </w:t>
-      </w:r>
-      <w:r>
-        <w:rPr>
-          <w:rFonts w:ascii="Calibri" w:hAnsi="Calibri"/>
-          <w:sz w:val="19"/>
-        </w:rPr>
-        <w:t>gestión del cambio del PETI.</w:t>
+        <w:t xml:space="preserve">• Derivar las implicancias del perfil cultural para condicionar la hoja de </w:t>
+      </w:r>
+      <w:r>
+        <w:rPr>
+          <w:rFonts w:ascii="Calibri" w:hAnsi="Calibri"/>
+          <w:sz w:val="19"/>
+        </w:rPr>
+        <w:t>ruta y la estrategia de gestión del cambio del PETI.</w:t>
       </w:r>
     </w:p>
     <w:p>
@@ -2014,7 +1996,7 @@
         <w:pStyle w:val="Ttulo2"/>
       </w:pPr>
       <w:bookmarkStart w:id="7" w:name="tiempo-de-duración"/>
-      <w:bookmarkStart w:id="8" w:name="_Toc240736113"/>
+      <w:bookmarkStart w:id="8" w:name="_Toc240737907"/>
       <w:bookmarkEnd w:id="5"/>
       <w:r>
         <w:t>1.3 Tiempo de duración</w:t>
@@ -2030,14 +2012,14 @@
           <w:rFonts w:ascii="Calibri" w:hAnsi="Calibri"/>
           <w:sz w:val="19"/>
         </w:rPr>
-        <w:t xml:space="preserve">100 minutos (Sesión 2 en laboratorio · evaluación </w:t>
-      </w:r>
-      <w:r>
-        <w:rPr>
-          <w:rFonts w:ascii="Calibri" w:hAnsi="Calibri"/>
-          <w:sz w:val="19"/>
-        </w:rPr>
-        <w:t>procedimental).</w:t>
+        <w:t xml:space="preserve">100 minutos (Sesión 2 en </w:t>
+      </w:r>
+      <w:r>
+        <w:rPr>
+          <w:rFonts w:ascii="Calibri" w:hAnsi="Calibri"/>
+          <w:sz w:val="19"/>
+        </w:rPr>
+        <w:t>laboratorio · evaluación procedimental).</w:t>
       </w:r>
     </w:p>
     <w:p>
@@ -2045,7 +2027,7 @@
         <w:pStyle w:val="Ttulo2"/>
       </w:pPr>
       <w:bookmarkStart w:id="9" w:name="resultados-de-aprendizaje"/>
-      <w:bookmarkStart w:id="10" w:name="_Toc240736114"/>
+      <w:bookmarkStart w:id="10" w:name="_Toc240737908"/>
       <w:bookmarkEnd w:id="7"/>
       <w:r>
         <w:t>1.4 Resultados de aprendizaje</w:t>
@@ -2073,14 +2055,14 @@
           <w:rFonts w:ascii="Calibri" w:hAnsi="Calibri"/>
           <w:sz w:val="19"/>
         </w:rPr>
-        <w:t>• Deduce supuestos básicos invisibles que condicionan el com</w:t>
-      </w:r>
-      <w:r>
-        <w:rPr>
-          <w:rFonts w:ascii="Calibri" w:hAnsi="Calibri"/>
-          <w:sz w:val="19"/>
-        </w:rPr>
-        <w:t>portamiento institucional a partir de reglamentos, manuales de organización y funciones.</w:t>
+        <w:t>• Deduce supuestos básicos invisibl</w:t>
+      </w:r>
+      <w:r>
+        <w:rPr>
+          <w:rFonts w:ascii="Calibri" w:hAnsi="Calibri"/>
+          <w:sz w:val="19"/>
+        </w:rPr>
+        <w:t>es que condicionan el comportamiento institucional a partir de reglamentos, manuales de organización y funciones.</w:t>
       </w:r>
     </w:p>
     <w:p>
@@ -2104,14 +2086,7 @@
           <w:rFonts w:ascii="Calibri" w:hAnsi="Calibri"/>
           <w:sz w:val="19"/>
         </w:rPr>
-        <w:t xml:space="preserve">• Diseña estrategias de </w:t>
-      </w:r>
-      <w:r>
-        <w:rPr>
-          <w:rFonts w:ascii="Calibri" w:hAnsi="Calibri"/>
-          <w:sz w:val="19"/>
-        </w:rPr>
-        <w:t>viabilización y mitigación cultural para proyectos de Gobierno Digital y Transformación Digital dentro del PETI.</w:t>
+        <w:t>• Diseña estrategias de viabilización y mitigación cultural para proyectos de Gobierno Digital y Transformación Digital dentro del PETI.</w:t>
       </w:r>
     </w:p>
     <w:p>
@@ -2119,7 +2094,7 @@
         <w:pStyle w:val="Ttulo2"/>
       </w:pPr>
       <w:bookmarkStart w:id="11" w:name="recursos"/>
-      <w:bookmarkStart w:id="12" w:name="_Toc240736115"/>
+      <w:bookmarkStart w:id="12" w:name="_Toc240737909"/>
       <w:bookmarkEnd w:id="9"/>
       <w:r>
         <w:t>1.5 Recursos</w:t>
@@ -2143,7 +2118,7 @@
       <w:tblGrid>
         <w:gridCol w:w="1146"/>
         <w:gridCol w:w="962"/>
-        <w:gridCol w:w="1819"/>
+        <w:gridCol w:w="5321"/>
       </w:tblGrid>
       <w:tr>
         <w:trPr>
@@ -2305,15 +2280,7 @@
                 <w:color w:val="000000"/>
                 <w:sz w:val="16"/>
               </w:rPr>
-              <w:t xml:space="preserve">Control de calidad de </w:t>
-            </w:r>
-            <w:r>
-              <w:rPr>
-                <w:rFonts w:ascii="Calibri" w:hAnsi="Calibri"/>
-                <w:color w:val="000000"/>
-                <w:sz w:val="16"/>
-              </w:rPr>
-              <w:t>datos, procesamiento estadístico y cálculo de brechas culturales.</w:t>
+              <w:t>Control de calidad de datos, procesamiento estadístico y cálculo de brechas culturales.</w:t>
             </w:r>
           </w:p>
         </w:tc>
@@ -2469,7 +2436,7 @@
                 <w:color w:val="000000"/>
                 <w:sz w:val="16"/>
               </w:rPr>
-              <w:t xml:space="preserve">Generación de libros de cálculo Excel con resultados y </w:t>
+              <w:t xml:space="preserve">Generación de libros de cálculo Excel con </w:t>
             </w:r>
             <w:r>
               <w:rPr>
@@ -2477,16 +2444,7 @@
                 <w:color w:val="000000"/>
                 <w:sz w:val="16"/>
               </w:rPr>
-              <w:t xml:space="preserve">supuestos </w:t>
-            </w:r>
-            <w:r>
-              <w:rPr>
-                <w:rFonts w:ascii="Calibri" w:hAnsi="Calibri"/>
-                <w:color w:val="000000"/>
-                <w:sz w:val="16"/>
-              </w:rPr>
-              <w:lastRenderedPageBreak/>
-              <w:t>(Anexos B y D).</w:t>
+              <w:t>resultados y supuestos (Anexos B y D).</w:t>
             </w:r>
           </w:p>
         </w:tc>
@@ -2514,8 +2472,7 @@
                 <w:color w:val="000000"/>
                 <w:sz w:val="16"/>
               </w:rPr>
-              <w:lastRenderedPageBreak/>
-              <w:t>Git &amp; GitHub</w:t>
+              <w:t>Repositorio GitHub Oficial</w:t>
             </w:r>
           </w:p>
         </w:tc>
@@ -2540,7 +2497,7 @@
                 <w:color w:val="000000"/>
                 <w:sz w:val="16"/>
               </w:rPr>
-              <w:t>2.x</w:t>
+              <w:t>Git 2.x / Tag taller-05</w:t>
             </w:r>
           </w:p>
         </w:tc>
@@ -2565,7 +2522,15 @@
                 <w:color w:val="000000"/>
                 <w:sz w:val="16"/>
               </w:rPr>
-              <w:t>Control de versiones, trazabilidad y creación de etiquetas oficiales 'v0.5' y 'taller-05'.</w:t>
+              <w:t xml:space="preserve">Control de versiones y evidencias enlazadas: </w:t>
+            </w:r>
+            <w:r>
+              <w:rPr>
+                <w:rFonts w:ascii="Calibri" w:hAnsi="Calibri"/>
+                <w:color w:val="000000"/>
+                <w:sz w:val="16"/>
+              </w:rPr>
+              <w:t>https://github.com/GianfrancoArocutipa/Taller05_ArocutipaGIna/tree/taller-05</w:t>
             </w:r>
           </w:p>
         </w:tc>
@@ -2593,6 +2558,7 @@
                 <w:color w:val="000000"/>
                 <w:sz w:val="16"/>
               </w:rPr>
+              <w:lastRenderedPageBreak/>
               <w:t>PEI 2025-2030 (MPT)</w:t>
             </w:r>
           </w:p>
@@ -2643,15 +2609,7 @@
                 <w:color w:val="000000"/>
                 <w:sz w:val="16"/>
               </w:rPr>
-              <w:t xml:space="preserve">Fuente institucional para analizar la Misión, OEI.07 (Gobierno </w:t>
-            </w:r>
-            <w:r>
-              <w:rPr>
-                <w:rFonts w:ascii="Calibri" w:hAnsi="Calibri"/>
-                <w:color w:val="000000"/>
-                <w:sz w:val="16"/>
-              </w:rPr>
-              <w:t>Digital) y AEI.07.01-04.</w:t>
+              <w:t>Fuente institucional para analizar la Misión, OEI.07 (Gobierno Digital) y AEI.07.01-04.</w:t>
             </w:r>
           </w:p>
         </w:tc>
@@ -2704,7 +2662,15 @@
                 <w:color w:val="000000"/>
                 <w:sz w:val="16"/>
               </w:rPr>
-              <w:t>Edición oficial 2022</w:t>
+              <w:t xml:space="preserve">Edición </w:t>
+            </w:r>
+            <w:r>
+              <w:rPr>
+                <w:rFonts w:ascii="Calibri" w:hAnsi="Calibri"/>
+                <w:color w:val="000000"/>
+                <w:sz w:val="16"/>
+              </w:rPr>
+              <w:t>oficial 2022</w:t>
             </w:r>
           </w:p>
         </w:tc>
@@ -2807,15 +2773,7 @@
                 <w:color w:val="000000"/>
                 <w:sz w:val="16"/>
               </w:rPr>
-              <w:t xml:space="preserve">Artefacto institucional para inferir supuestos de </w:t>
-            </w:r>
-            <w:r>
-              <w:rPr>
-                <w:rFonts w:ascii="Calibri" w:hAnsi="Calibri"/>
-                <w:color w:val="000000"/>
-                <w:sz w:val="16"/>
-              </w:rPr>
-              <w:t>rigidez jerárquica y enfoque punitivo.</w:t>
+              <w:t>Artefacto institucional para inferir supuestos de rigidez jerárquica y enfoque punitivo.</w:t>
             </w:r>
           </w:p>
         </w:tc>
@@ -2843,7 +2801,16 @@
                 <w:color w:val="000000"/>
                 <w:sz w:val="16"/>
               </w:rPr>
-              <w:t>Ley N° 27815 (Código de Ética)</w:t>
+              <w:t xml:space="preserve">Ley N° 27815 (Código de </w:t>
+            </w:r>
+            <w:r>
+              <w:rPr>
+                <w:rFonts w:ascii="Calibri" w:hAnsi="Calibri"/>
+                <w:b/>
+                <w:color w:val="000000"/>
+                <w:sz w:val="16"/>
+              </w:rPr>
+              <w:t>Ética)</w:t>
             </w:r>
           </w:p>
         </w:tc>
@@ -2904,7 +2871,7 @@
         <w:pStyle w:val="Ttulo2"/>
       </w:pPr>
       <w:bookmarkStart w:id="13" w:name="seguridad"/>
-      <w:bookmarkStart w:id="14" w:name="_Toc240736116"/>
+      <w:bookmarkStart w:id="14" w:name="_Toc240737910"/>
       <w:bookmarkEnd w:id="11"/>
       <w:r>
         <w:t>1.6 Seguridad</w:t>
@@ -2916,42 +2883,39 @@
         <w:spacing w:after="160"/>
       </w:pPr>
       <w:r>
-        <w:t xml:space="preserve">Durante la ejecución del diagnóstico y el trabajo en </w:t>
-      </w:r>
-      <w:r>
-        <w:t>laboratorio se observaron estrictamente las siguientes medidas de seguridad física, lógica y ética:</w:t>
+        <w:t xml:space="preserve">Durante la ejecución del diagnóstico y el trabajo en laboratorio se observaron estrictamente las siguientes medidas de seguridad </w:t>
+      </w:r>
+      <w:r>
+        <w:t>física, lógica y ética:</w:t>
       </w:r>
       <w:r>
         <w:br/>
-        <w:t>1. Anonimato riguroso conforme a la Ley N° 29733 (Protección de Datos Personales) y D.S. 016-2024-JUS: El instrumento no recolectó ningún identificador pers</w:t>
-      </w:r>
-      <w:r>
-        <w:t>onal (nombres, DNI ni correos personales). Las unidades orgánicas se agregaron únicamente para gerencias con al menos cinco respondientes, blindando la identidad de los trabajadores.</w:t>
+        <w:t>1. Anonimato riguroso conforme a la Ley N° 29733 (Protección de Datos Personales) y D.S. 016-2024-JUS: El instrumento no recolectó ningún identificador personal (nombres, DNI ni correos personales). Las unidades orgánicas se agregar</w:t>
+      </w:r>
+      <w:r>
+        <w:t>on únicamente para gerencias con al menos cinco respondientes, blindando la identidad de los trabajadores.</w:t>
       </w:r>
       <w:r>
         <w:br/>
-        <w:t>2. Agregación y confidencialidad: Los resultados se entregan consolidados</w:t>
-      </w:r>
-      <w:r>
-        <w:t xml:space="preserve"> por dimensiones institucionales; jamás se divulgan microdatos individuales.</w:t>
+        <w:t>2. Agregación y confidencialidad: Los resultados se entregan consolidados por dimensiones institucionales; jamás se divulgan microdatos individuales.</w:t>
       </w:r>
       <w:r>
         <w:br/>
-        <w:t>3. Neutralidad técnica deontológica: El equipo formulador mantuvo una perspectiva descriptiva-propositiva, absteniéndose de emitir juicios de valor sobre autoridades o funcionario</w:t>
-      </w:r>
-      <w:r>
-        <w:t>s.</w:t>
+        <w:t>3. Neutralidad técnica deontológica: El equipo formulador mantuvo una perspectiva descriptiva-propositiva, absteniéndose de emitir juicios de valor sobre autoridades o funcionarios.</w:t>
       </w:r>
       <w:r>
         <w:br/>
-        <w:t>4. Custodia y destrucción de datos: Las respuestas digitales permanecen almacenadas en entornos cifrados locales y serán eliminadas al concluir el semestre académico.</w:t>
+        <w:t>4. Custodia y destrucción de datos: Las respuestas digitales permanecen a</w:t>
+      </w:r>
+      <w:r>
+        <w:t>lmacenadas en entornos cifrados locales y serán eliminadas al concluir el semestre académico.</w:t>
       </w:r>
       <w:r>
         <w:br/>
-        <w:t>5. Normas de uso del centro de cómputo EPIS-UPT: Uso adecuado de los recursos computac</w:t>
-      </w:r>
-      <w:r>
-        <w:t>ionales, ejecución de scripts sin privilegios administrativos invasivos y respeto a la política de red institucional.</w:t>
+        <w:t>5. Normas de uso del centro de cómputo EPIS-UPT: Uso adecuado de los recursos computacionales, ejecución de scripts sin privilegios administrativos invasivos y re</w:t>
+      </w:r>
+      <w:r>
+        <w:t>speto a la política de red institucional.</w:t>
       </w:r>
     </w:p>
     <w:p>
@@ -2959,7 +2923,7 @@
         <w:pStyle w:val="Ttulo1"/>
       </w:pPr>
       <w:bookmarkStart w:id="15" w:name="procedimiento-o-metodología"/>
-      <w:bookmarkStart w:id="16" w:name="_Toc240736117"/>
+      <w:bookmarkStart w:id="16" w:name="_Toc240737911"/>
       <w:bookmarkEnd w:id="1"/>
       <w:bookmarkEnd w:id="13"/>
       <w:r>
@@ -2972,20 +2936,19 @@
         <w:pStyle w:val="FirstParagraph"/>
       </w:pPr>
       <w:r>
-        <w:t>Cada paso lleva su título, qué se buscaba, el comando o la acción, y la evidencia de que funcionó. Quien le</w:t>
-      </w:r>
-      <w:r>
-        <w:t>a el informe debe poder repetir el trabajo sin preguntar nada.</w:t>
+        <w:t>Cada paso lleva su título, qué se buscaba, el comando o la acción, y la evidencia de que funcionó. Quien lea el informe debe poder repetir el trabajo sin preguntar nada.</w:t>
       </w:r>
     </w:p>
     <w:p>
       <w:pPr>
         <w:pStyle w:val="Ttulo2"/>
       </w:pPr>
-      <w:bookmarkStart w:id="17" w:name="_Toc240736118"/>
-      <w:r>
-        <w:lastRenderedPageBreak/>
-        <w:t>Paso A — Aplicar el Instrumento del Competing Values Framework (15 min)</w:t>
+      <w:bookmarkStart w:id="17" w:name="_Toc240737912"/>
+      <w:r>
+        <w:t xml:space="preserve">Paso A — </w:t>
+      </w:r>
+      <w:r>
+        <w:t>Aplicar el Instrumento del Competing Values Framework (15 min)</w:t>
       </w:r>
       <w:bookmarkEnd w:id="17"/>
     </w:p>
@@ -3007,14 +2970,14 @@
           <w:rFonts w:ascii="Calibri" w:hAnsi="Calibri"/>
           <w:sz w:val="19"/>
         </w:rPr>
-        <w:t xml:space="preserve">Determinar el perfil cultural de la Municipalidad Provincial de Tacna mediante la aplicación del </w:t>
-      </w:r>
-      <w:r>
-        <w:rPr>
-          <w:rFonts w:ascii="Calibri" w:hAnsi="Calibri"/>
-          <w:sz w:val="19"/>
-        </w:rPr>
-        <w:t>instrumento OCAI de seis dimensiones con escala de suma forzada (100 puntos) entre los cuadrantes Clan (A), Adhocracia (B), Mercado (C) y Jerarquía (D) en dos momentos temporales: Actual y Deseado a 5 años (2030).</w:t>
+        <w:t>Determinar el perfil cultural de la Municipalidad Provincial de Tacna mediante la aplicación del instrumento OCAI de seis dimensiones con escala de suma forzada (100 puntos) e</w:t>
+      </w:r>
+      <w:r>
+        <w:rPr>
+          <w:rFonts w:ascii="Calibri" w:hAnsi="Calibri"/>
+          <w:sz w:val="19"/>
+        </w:rPr>
+        <w:t>ntre los cuadrantes Clan (A), Adhocracia (B), Mercado (C) y Jerarquía (D) en dos momentos temporales: Actual y Deseado a 5 años (2030).</w:t>
       </w:r>
     </w:p>
     <w:p>
@@ -3035,14 +2998,21 @@
           <w:rFonts w:ascii="Calibri" w:hAnsi="Calibri"/>
           <w:sz w:val="19"/>
         </w:rPr>
-        <w:t>Diseño del instrumento</w:t>
-      </w:r>
-      <w:r>
-        <w:rPr>
-          <w:rFonts w:ascii="Calibri" w:hAnsi="Calibri"/>
-          <w:sz w:val="19"/>
-        </w:rPr>
-        <w:t xml:space="preserve"> contextualizado '02_identidad/CU01_instrumento.md' y levantamiento de una muestra de N=35 encuestas distribuidas en seis gerencias representativas de la sede central de la MPT, registradas en '02_identidad/encuesta_cultura.csv'.</w:t>
+        <w:t>Diseño del instrumento contextualizado '02_identidad/CU01_instrumento.md' y levantamiento de una mue</w:t>
+      </w:r>
+      <w:r>
+        <w:rPr>
+          <w:rFonts w:ascii="Calibri" w:hAnsi="Calibri"/>
+          <w:sz w:val="19"/>
+        </w:rPr>
+        <w:t>stra de N=35 encuestas distribuidas en seis gerencias representativas de la sede central de la MPT, registradas en '02_identidad/encuesta_cultura.csv' (versionado en GitHub: https://github.com/GianfrancoArocutipa/Taller05_ArocutipaGIna/tree/taller-05/02_id</w:t>
+      </w:r>
+      <w:r>
+        <w:rPr>
+          <w:rFonts w:ascii="Calibri" w:hAnsi="Calibri"/>
+          <w:sz w:val="19"/>
+        </w:rPr>
+        <w:t>entidad/encuesta_cultura.csv).</w:t>
       </w:r>
     </w:p>
     <w:p>
@@ -3056,8 +3026,43 @@
           <w:color w:val="16285C"/>
           <w:sz w:val="19"/>
         </w:rPr>
-        <w:t>• Evidencia de que funcion</w:t>
-      </w:r>
+        <w:t xml:space="preserve">• Evidencia de que funcionó: </w:t>
+      </w:r>
+      <w:r>
+        <w:rPr>
+          <w:rFonts w:ascii="Calibri" w:hAnsi="Calibri"/>
+          <w:sz w:val="19"/>
+        </w:rPr>
+        <w:t>Archivo de especificación del instrumento '02_identidad/CU01_instrumento.md' con las 6 dimensiones adaptadas a la corporación edil y dataset estructurado '02_identidad/encuesta_cultura.csv' conten</w:t>
+      </w:r>
+      <w:r>
+        <w:rPr>
+          <w:rFonts w:ascii="Calibri" w:hAnsi="Calibri"/>
+          <w:sz w:val="19"/>
+        </w:rPr>
+        <w:t>iendo 35 registros y 51 variables de evaluación.</w:t>
+      </w:r>
+    </w:p>
+    <w:p>
+      <w:pPr>
+        <w:pStyle w:val="Ttulo2"/>
+        <w:spacing w:after="80" w:line="276" w:lineRule="auto"/>
+      </w:pPr>
+      <w:bookmarkStart w:id="18" w:name="_Toc240737913"/>
+      <w:r>
+        <w:rPr>
+          <w:rFonts w:ascii="Calibri" w:hAnsi="Calibri"/>
+          <w:sz w:val="19"/>
+        </w:rPr>
+        <w:lastRenderedPageBreak/>
+        <w:t>Paso B — Calcular el Perfil Cultural y Brechas (15 min)</w:t>
+      </w:r>
+      <w:bookmarkEnd w:id="18"/>
+    </w:p>
+    <w:p>
+      <w:pPr>
+        <w:spacing w:after="80" w:line="276" w:lineRule="auto"/>
+      </w:pPr>
       <w:r>
         <w:rPr>
           <w:rFonts w:ascii="Calibri" w:hAnsi="Calibri"/>
@@ -3065,37 +3070,22 @@
           <w:color w:val="16285C"/>
           <w:sz w:val="19"/>
         </w:rPr>
-        <w:t xml:space="preserve">ó: </w:t>
-      </w:r>
-      <w:r>
-        <w:rPr>
-          <w:rFonts w:ascii="Calibri" w:hAnsi="Calibri"/>
-          <w:sz w:val="19"/>
-        </w:rPr>
-        <w:t>Archivo de especificación del instrumento '02_identidad/CU01_instrumento.md' con las 6 dimensiones adaptadas a la corporación edil y dataset estructurado '02_identidad/encuesta_cultura.csv' conteniendo 35 registros y 51 variables de evaluación.</w:t>
-      </w:r>
-    </w:p>
-    <w:p>
-      <w:pPr>
-        <w:pStyle w:val="Ttulo2"/>
-        <w:spacing w:after="80" w:line="276" w:lineRule="auto"/>
-      </w:pPr>
-      <w:bookmarkStart w:id="18" w:name="_Toc240736119"/>
-      <w:r>
-        <w:rPr>
-          <w:rFonts w:ascii="Calibri" w:hAnsi="Calibri"/>
-          <w:sz w:val="19"/>
-        </w:rPr>
-        <w:t>Paso B —</w:t>
-      </w:r>
-      <w:r>
-        <w:rPr>
-          <w:rFonts w:ascii="Calibri" w:hAnsi="Calibri"/>
-          <w:sz w:val="19"/>
-        </w:rPr>
-        <w:t xml:space="preserve"> Calcular el Perfil Cultural y Brechas (15 min)</w:t>
-      </w:r>
-      <w:bookmarkEnd w:id="18"/>
+        <w:t xml:space="preserve">• Qué se buscaba: </w:t>
+      </w:r>
+      <w:r>
+        <w:rPr>
+          <w:rFonts w:ascii="Calibri" w:hAnsi="Calibri"/>
+          <w:sz w:val="19"/>
+        </w:rPr>
+        <w:t>Ejecutar el control de calidad matemático estricto (exclusión de encuestas cuya suma en cualquier bloque no sea exactamente 100), cal</w:t>
+      </w:r>
+      <w:r>
+        <w:rPr>
+          <w:rFonts w:ascii="Calibri" w:hAnsi="Calibri"/>
+          <w:sz w:val="19"/>
+        </w:rPr>
+        <w:t>cular promedios dimensionales y globales, determinar brechas netas, identificar culturas dominantes, evaluar congruencia y generar la visualización en radar.</w:t>
+      </w:r>
     </w:p>
     <w:p>
       <w:pPr>
@@ -3108,21 +3098,21 @@
           <w:color w:val="16285C"/>
           <w:sz w:val="19"/>
         </w:rPr>
-        <w:t xml:space="preserve">• Qué se buscaba: </w:t>
-      </w:r>
-      <w:r>
-        <w:rPr>
-          <w:rFonts w:ascii="Calibri" w:hAnsi="Calibri"/>
-          <w:sz w:val="19"/>
-        </w:rPr>
-        <w:t>Ejecutar el control de calidad matemático estricto (exclusión de encuestas cuya suma en cualquier bloque no sea exactamente 100), calcular promedios dimensionales y globales, determinar brec</w:t>
-      </w:r>
-      <w:r>
-        <w:rPr>
-          <w:rFonts w:ascii="Calibri" w:hAnsi="Calibri"/>
-          <w:sz w:val="19"/>
-        </w:rPr>
-        <w:t>has netas, identificar culturas dominantes, evaluar congruencia y generar la visualización en radar.</w:t>
+        <w:t xml:space="preserve">• Comando o acción: </w:t>
+      </w:r>
+      <w:r>
+        <w:rPr>
+          <w:rFonts w:ascii="Calibri" w:hAnsi="Calibri"/>
+          <w:sz w:val="19"/>
+        </w:rPr>
+        <w:t>Desarrollo y ejecución del script automatizado en Python: 'python 02_identidad</w:t>
+      </w:r>
+      <w:r>
+        <w:rPr>
+          <w:rFonts w:ascii="Calibri" w:hAnsi="Calibri"/>
+          <w:sz w:val="19"/>
+        </w:rPr>
+        <w:t>/CU02_perfil_cultura.py' (código: https://github.com/GianfrancoArocutipa/Taller05_ArocutipaGIna/tree/taller-05/02_identidad/CU02_perfil_cultura.py).</w:t>
       </w:r>
     </w:p>
     <w:p>
@@ -3136,62 +3126,49 @@
           <w:color w:val="16285C"/>
           <w:sz w:val="19"/>
         </w:rPr>
-        <w:t xml:space="preserve">• Comando o acción: </w:t>
-      </w:r>
-      <w:r>
-        <w:rPr>
-          <w:rFonts w:ascii="Calibri" w:hAnsi="Calibri"/>
-          <w:sz w:val="19"/>
-        </w:rPr>
-        <w:t>Desarrollo y ejecución del script automatizado en Python: 'python 02_identidad/CU02_perfil_cultura.py'.</w:t>
-      </w:r>
-    </w:p>
-    <w:p>
-      <w:pPr>
-        <w:spacing w:after="80" w:line="276" w:lineRule="auto"/>
+        <w:t xml:space="preserve">• Evidencia de que funcionó: </w:t>
+      </w:r>
+      <w:r>
+        <w:rPr>
+          <w:rFonts w:ascii="Calibri" w:hAnsi="Calibri"/>
+          <w:sz w:val="19"/>
+        </w:rPr>
+        <w:t>El script auditó las 35 encuestas, identificando y excluyendo con éxito 3 caso</w:t>
+      </w:r>
+      <w:r>
+        <w:rPr>
+          <w:rFonts w:ascii="Calibri" w:hAnsi="Calibri"/>
+          <w:sz w:val="19"/>
+        </w:rPr>
+        <w:t>s inconsistentes (R015 en OGAF con 110 pts; R024 en OGACGD con 90 pts; R031 en GTPSC con 105 pts), procesando 32 encuestas válidas (91.4% de efectividad). Se generó la matriz '02_identidad/CU02_perfil_cultura.csv', el informe de control de calidad 'docs/ev</w:t>
+      </w:r>
+      <w:r>
+        <w:rPr>
+          <w:rFonts w:ascii="Calibri" w:hAnsi="Calibri"/>
+          <w:sz w:val="19"/>
+        </w:rPr>
+        <w:t>idencias/S05/salidas/control_calidad.txt' y el renderizado '02_identidad/CU_perfil_cultura.png' (https://github.com/GianfrancoArocutipa/Taller05_ArocutipaGIna/tree/taller-05/02_identidad/CU_perfil_cultura.png).</w:t>
+      </w:r>
+    </w:p>
+    <w:p>
+      <w:pPr>
+        <w:spacing w:after="60" w:line="276" w:lineRule="auto"/>
       </w:pPr>
       <w:r>
         <w:rPr>
           <w:rFonts w:ascii="Calibri" w:hAnsi="Calibri"/>
           <w:b/>
-          <w:color w:val="16285C"/>
-          <w:sz w:val="19"/>
-        </w:rPr>
-        <w:t xml:space="preserve">• Evidencia de que funcionó: </w:t>
-      </w:r>
-      <w:r>
-        <w:rPr>
-          <w:rFonts w:ascii="Calibri" w:hAnsi="Calibri"/>
-          <w:sz w:val="19"/>
-        </w:rPr>
-        <w:t>El</w:t>
-      </w:r>
-      <w:r>
-        <w:rPr>
-          <w:rFonts w:ascii="Calibri" w:hAnsi="Calibri"/>
-          <w:sz w:val="19"/>
-        </w:rPr>
-        <w:t xml:space="preserve"> script auditó las 35 encuestas, identificando y excluyendo con éxito 3 casos inconsistentes (R015 en OGAF con 110 pts; R024 en OGACGD con 90 pts; R031 en GTPSC con 105 pts), procesando 32 encuestas válidas (91.4% de efectividad). Se generó la matriz '02_i</w:t>
-      </w:r>
-      <w:r>
-        <w:rPr>
-          <w:rFonts w:ascii="Calibri" w:hAnsi="Calibri"/>
-          <w:sz w:val="19"/>
-        </w:rPr>
-        <w:t>dentidad/CU02_perfil_cultura.csv', el informe de control de calidad 'docs/evidencias/S05/salidas/control_calidad.txt' y el renderizado '02_identidad/CU_perfil_cultura.png'.</w:t>
-      </w:r>
-    </w:p>
-    <w:p>
-      <w:pPr>
-        <w:spacing w:after="60" w:line="276" w:lineRule="auto"/>
-      </w:pPr>
+          <w:sz w:val="19"/>
+        </w:rPr>
+        <w:t>Tabla 2.1: Consolidado de Puntajes Globales y</w:t>
+      </w:r>
       <w:r>
         <w:rPr>
           <w:rFonts w:ascii="Calibri" w:hAnsi="Calibri"/>
           <w:b/>
           <w:sz w:val="19"/>
         </w:rPr>
-        <w:t>Tabla 2.1: Consolidado de Puntajes Globales y Brechas Culturales (MPT)</w:t>
+        <w:t xml:space="preserve"> Brechas Culturales (MPT)</w:t>
       </w:r>
     </w:p>
     <w:p>
@@ -3225,7 +3202,7 @@
         <w:pStyle w:val="Ttulo2"/>
         <w:spacing w:after="80" w:line="276" w:lineRule="auto"/>
       </w:pPr>
-      <w:bookmarkStart w:id="19" w:name="_Toc240736120"/>
+      <w:bookmarkStart w:id="19" w:name="_Toc240737914"/>
       <w:r>
         <w:rPr>
           <w:rFonts w:ascii="Calibri" w:hAnsi="Calibri"/>
@@ -3253,14 +3230,14 @@
           <w:rFonts w:ascii="Calibri" w:hAnsi="Calibri"/>
           <w:sz w:val="19"/>
         </w:rPr>
-        <w:t>Descubrir los supuestos inconscientes que rigen las decisiones ope</w:t>
-      </w:r>
-      <w:r>
-        <w:rPr>
-          <w:rFonts w:ascii="Calibri" w:hAnsi="Calibri"/>
-          <w:sz w:val="19"/>
-        </w:rPr>
-        <w:t>rativas reales mediante la confrontación sistemática entre artefactos físicos/documentales y el discurso de valores adoptados.</w:t>
+        <w:t xml:space="preserve">Descubrir los supuestos </w:t>
+      </w:r>
+      <w:r>
+        <w:rPr>
+          <w:rFonts w:ascii="Calibri" w:hAnsi="Calibri"/>
+          <w:sz w:val="19"/>
+        </w:rPr>
+        <w:t>inconscientes que rigen las decisiones operativas reales mediante la confrontación sistemática entre artefactos físicos/documentales y el discurso de valores adoptados.</w:t>
       </w:r>
     </w:p>
     <w:p>
@@ -3281,14 +3258,14 @@
           <w:rFonts w:ascii="Calibri" w:hAnsi="Calibri"/>
           <w:sz w:val="19"/>
         </w:rPr>
-        <w:t>Análisis hermenéutico y de discurso sobre el ROF 2022, RISST 2024 (51 pp.), PEI 2025-2030 y Ley 27815, sintet</w:t>
-      </w:r>
-      <w:r>
-        <w:rPr>
-          <w:rFonts w:ascii="Calibri" w:hAnsi="Calibri"/>
-          <w:sz w:val="19"/>
-        </w:rPr>
-        <w:t>izado en '02_identidad/CU03_supuestos.csv'.</w:t>
+        <w:t>Análisis hermenéutico y de discurso sobre el ROF 2022, RISST 2024 (</w:t>
+      </w:r>
+      <w:r>
+        <w:rPr>
+          <w:rFonts w:ascii="Calibri" w:hAnsi="Calibri"/>
+          <w:sz w:val="19"/>
+        </w:rPr>
+        <w:t>51 pp.), PEI 2025-2030 y Ley 27815, sintetizado en '02_identidad/CU03_supuestos.csv' (URL: https://github.com/GianfrancoArocutipa/Taller05_ArocutipaGIna/tree/taller-05/02_identidad/CU03_supuestos.csv).</w:t>
       </w:r>
     </w:p>
     <w:p>
@@ -3309,7 +3286,14 @@
           <w:rFonts w:ascii="Calibri" w:hAnsi="Calibri"/>
           <w:sz w:val="19"/>
         </w:rPr>
-        <w:t>Matriz formal con 6 supuestos identificados, de los cuales 5 evidencian una contradicción flagrante con los valores adoptados (brechas de autenticidad cultural).</w:t>
+        <w:t>Matriz formal con 6 supue</w:t>
+      </w:r>
+      <w:r>
+        <w:rPr>
+          <w:rFonts w:ascii="Calibri" w:hAnsi="Calibri"/>
+          <w:sz w:val="19"/>
+        </w:rPr>
+        <w:t>stos identificados, de los cuales 5 evidencian una contradicción flagrante con los valores adoptados (brechas de autenticidad cultural).</w:t>
       </w:r>
     </w:p>
     <w:p>
@@ -3322,15 +3306,7 @@
           <w:b/>
           <w:sz w:val="19"/>
         </w:rPr>
-        <w:t xml:space="preserve">Tabla 2.2: Matriz de </w:t>
-      </w:r>
-      <w:r>
-        <w:rPr>
-          <w:rFonts w:ascii="Calibri" w:hAnsi="Calibri"/>
-          <w:b/>
-          <w:sz w:val="19"/>
-        </w:rPr>
-        <w:t>Supuestos Básicos y Brechas de Autenticidad (MPT)</w:t>
+        <w:t>Tabla 2.2: Matriz de Supuestos Básicos y Brechas de Autenticidad (MPT)</w:t>
       </w:r>
     </w:p>
     <w:p>
@@ -3343,13 +3319,20 @@
         <w:pStyle w:val="Ttulo2"/>
         <w:spacing w:after="80" w:line="276" w:lineRule="auto"/>
       </w:pPr>
-      <w:bookmarkStart w:id="20" w:name="_Toc240736121"/>
-      <w:r>
-        <w:rPr>
-          <w:rFonts w:ascii="Calibri" w:hAnsi="Calibri"/>
-          <w:sz w:val="19"/>
-        </w:rPr>
-        <w:t>Paso D — Derivar Implicancias para el PETI (10 min)</w:t>
+      <w:bookmarkStart w:id="20" w:name="_Toc240737915"/>
+      <w:r>
+        <w:rPr>
+          <w:rFonts w:ascii="Calibri" w:hAnsi="Calibri"/>
+          <w:sz w:val="19"/>
+        </w:rPr>
+        <w:t xml:space="preserve">Paso D — Derivar Implicancias para el PETI (10 </w:t>
+      </w:r>
+      <w:r>
+        <w:rPr>
+          <w:rFonts w:ascii="Calibri" w:hAnsi="Calibri"/>
+          <w:sz w:val="19"/>
+        </w:rPr>
+        <w:t>min)</w:t>
       </w:r>
       <w:bookmarkEnd w:id="20"/>
     </w:p>
@@ -3371,14 +3354,7 @@
           <w:rFonts w:ascii="Calibri" w:hAnsi="Calibri"/>
           <w:sz w:val="19"/>
         </w:rPr>
-        <w:t xml:space="preserve">Traducir los hallazgos culturales cuantitativos y los supuestos básicos inferidos en riesgos de implantación y definir las estrategias </w:t>
-      </w:r>
-      <w:r>
-        <w:rPr>
-          <w:rFonts w:ascii="Calibri" w:hAnsi="Calibri"/>
-          <w:sz w:val="19"/>
-        </w:rPr>
-        <w:t>técnicas y de cambio organizacional que deben incorporarse en el PETI.</w:t>
+        <w:t>Traducir los hallazgos culturales cuantitativos y los supuestos básicos inferidos en riesgos de implantación y definir las estrategias técnicas y de cambio organizacional que deben incorporarse en el PETI.</w:t>
       </w:r>
     </w:p>
     <w:p>
@@ -3399,7 +3375,21 @@
           <w:rFonts w:ascii="Calibri" w:hAnsi="Calibri"/>
           <w:sz w:val="19"/>
         </w:rPr>
-        <w:t>Construcción de la matriz estratégica '02_identidad/CU04_implicancias_peti.md', articulándola con los objetivos de Gobierno Digital del PEI 2025-2030 (OEI.07).</w:t>
+        <w:t>Constru</w:t>
+      </w:r>
+      <w:r>
+        <w:rPr>
+          <w:rFonts w:ascii="Calibri" w:hAnsi="Calibri"/>
+          <w:sz w:val="19"/>
+        </w:rPr>
+        <w:t>cción de la matriz estratégica '02_identidad/CU04_implicancias_peti.md' (https://github.com/GianfrancoArocutipa/Taller05_ArocutipaGIna/tree/taller-05/02_identidad/CU04_implicancias_peti.md), articulándola con los objetivos de Gobierno Digital del PEI 2025-</w:t>
+      </w:r>
+      <w:r>
+        <w:rPr>
+          <w:rFonts w:ascii="Calibri" w:hAnsi="Calibri"/>
+          <w:sz w:val="19"/>
+        </w:rPr>
+        <w:t>2030 (OEI.07).</w:t>
       </w:r>
     </w:p>
     <w:p>
@@ -3413,8 +3403,61 @@
           <w:color w:val="16285C"/>
           <w:sz w:val="19"/>
         </w:rPr>
-        <w:t>• Evi</w:t>
-      </w:r>
+        <w:t xml:space="preserve">• Evidencia de que funcionó: </w:t>
+      </w:r>
+      <w:r>
+        <w:rPr>
+          <w:rFonts w:ascii="Calibri" w:hAnsi="Calibri"/>
+          <w:sz w:val="19"/>
+        </w:rPr>
+        <w:t>Matriz de implicancias que condiciona directamente la secuencia técnica de la hoja de ruta (Sección 7.3) y el plan de gestión del cambio y comunicaciones (Sección 10).</w:t>
+      </w:r>
+    </w:p>
+    <w:p>
+      <w:pPr>
+        <w:spacing w:after="60" w:line="276" w:lineRule="auto"/>
+      </w:pPr>
+      <w:r>
+        <w:rPr>
+          <w:rFonts w:ascii="Calibri" w:hAnsi="Calibri"/>
+          <w:b/>
+          <w:sz w:val="19"/>
+        </w:rPr>
+        <w:t>Tabla 2.3: Implicancias Estratégicas para la</w:t>
+      </w:r>
+      <w:r>
+        <w:rPr>
+          <w:rFonts w:ascii="Calibri" w:hAnsi="Calibri"/>
+          <w:b/>
+          <w:sz w:val="19"/>
+        </w:rPr>
+        <w:t xml:space="preserve"> Implantación del PETI (MPT)</w:t>
+      </w:r>
+    </w:p>
+    <w:p>
+      <w:pPr>
+        <w:spacing w:after="80" w:line="276" w:lineRule="auto"/>
+      </w:pPr>
+    </w:p>
+    <w:p>
+      <w:pPr>
+        <w:pStyle w:val="Ttulo2"/>
+        <w:spacing w:after="80" w:line="276" w:lineRule="auto"/>
+      </w:pPr>
+      <w:bookmarkStart w:id="21" w:name="_Toc240737916"/>
+      <w:r>
+        <w:rPr>
+          <w:rFonts w:ascii="Calibri" w:hAnsi="Calibri"/>
+          <w:sz w:val="19"/>
+        </w:rPr>
+        <w:t>Paso E — Formular los Valores y Redactar Secciones 2.3 y 2.4 (10 min)</w:t>
+      </w:r>
+      <w:bookmarkEnd w:id="21"/>
+    </w:p>
+    <w:p>
+      <w:pPr>
+        <w:spacing w:after="80" w:line="276" w:lineRule="auto"/>
+      </w:pPr>
       <w:r>
         <w:rPr>
           <w:rFonts w:ascii="Calibri" w:hAnsi="Calibri"/>
@@ -3422,57 +3465,101 @@
           <w:color w:val="16285C"/>
           <w:sz w:val="19"/>
         </w:rPr>
-        <w:t xml:space="preserve">dencia de que funcionó: </w:t>
-      </w:r>
-      <w:r>
-        <w:rPr>
-          <w:rFonts w:ascii="Calibri" w:hAnsi="Calibri"/>
-          <w:sz w:val="19"/>
-        </w:rPr>
-        <w:t>Matriz de implicancias que condiciona directamente la secuencia técnica de la hoja de ruta (Sección 7.3) y el plan de gestión del cambio y comunicaciones (Sección 10).</w:t>
-      </w:r>
-    </w:p>
-    <w:p>
-      <w:pPr>
-        <w:spacing w:after="60" w:line="276" w:lineRule="auto"/>
+        <w:t xml:space="preserve">• Qué se buscaba: </w:t>
+      </w:r>
+      <w:r>
+        <w:rPr>
+          <w:rFonts w:ascii="Calibri" w:hAnsi="Calibri"/>
+          <w:sz w:val="19"/>
+        </w:rPr>
+        <w:t xml:space="preserve">Formular el marco de valores institucionales en enunciados conductuales con consecuencias disciplinarias y renuncias expresas, y redactar </w:t>
+      </w:r>
+      <w:r>
+        <w:rPr>
+          <w:rFonts w:ascii="Calibri" w:hAnsi="Calibri"/>
+          <w:sz w:val="19"/>
+        </w:rPr>
+        <w:t>de forma integral las Secciones 2.3 y 2.4 del PETI de la MPT.</w:t>
+      </w:r>
+    </w:p>
+    <w:p>
+      <w:pPr>
+        <w:spacing w:after="80" w:line="276" w:lineRule="auto"/>
       </w:pPr>
       <w:r>
         <w:rPr>
           <w:rFonts w:ascii="Calibri" w:hAnsi="Calibri"/>
           <w:b/>
-          <w:sz w:val="19"/>
-        </w:rPr>
-        <w:t>Tabla 2.3: Implicancias Estratégicas para la Implantación del PE</w:t>
-      </w:r>
+          <w:color w:val="16285C"/>
+          <w:sz w:val="19"/>
+        </w:rPr>
+        <w:t xml:space="preserve">• Comando o acción: </w:t>
+      </w:r>
+      <w:r>
+        <w:rPr>
+          <w:rFonts w:ascii="Calibri" w:hAnsi="Calibri"/>
+          <w:sz w:val="19"/>
+        </w:rPr>
+        <w:t xml:space="preserve">Redacción de '02_identidad/2.3_valores.md' (https://github.com/GianfrancoArocutipa/Taller05_ArocutipaGIna/tree/taller-05/02_identidad/2.3_valores.md) y </w:t>
+      </w:r>
+      <w:r>
+        <w:rPr>
+          <w:rFonts w:ascii="Calibri" w:hAnsi="Calibri"/>
+          <w:sz w:val="19"/>
+        </w:rPr>
+        <w:lastRenderedPageBreak/>
+        <w:t>'02_identidad/2.4_cult</w:t>
+      </w:r>
+      <w:r>
+        <w:rPr>
+          <w:rFonts w:ascii="Calibri" w:hAnsi="Calibri"/>
+          <w:sz w:val="19"/>
+        </w:rPr>
+        <w:t>ura.md' (https://github.com/GianfrancoArocutipa/Taller05_ArocutipaGIna/tree/taller-05/02_identidad/2.4_cultura.md), incorporando criterios de decisión tecnológica.</w:t>
+      </w:r>
+    </w:p>
+    <w:p>
+      <w:pPr>
+        <w:spacing w:after="80" w:line="276" w:lineRule="auto"/>
+      </w:pPr>
       <w:r>
         <w:rPr>
           <w:rFonts w:ascii="Calibri" w:hAnsi="Calibri"/>
           <w:b/>
-          <w:sz w:val="19"/>
-        </w:rPr>
-        <w:t>TI (MPT)</w:t>
-      </w:r>
-    </w:p>
-    <w:p>
-      <w:pPr>
-        <w:spacing w:after="80" w:line="276" w:lineRule="auto"/>
-      </w:pPr>
+          <w:color w:val="16285C"/>
+          <w:sz w:val="19"/>
+        </w:rPr>
+        <w:t xml:space="preserve">• Evidencia de que funcionó: </w:t>
+      </w:r>
+      <w:r>
+        <w:rPr>
+          <w:rFonts w:ascii="Calibri" w:hAnsi="Calibri"/>
+          <w:sz w:val="19"/>
+        </w:rPr>
+        <w:t>Cinco valores institucionales conductuales operativos (Integrid</w:t>
+      </w:r>
+      <w:r>
+        <w:rPr>
+          <w:rFonts w:ascii="Calibri" w:hAnsi="Calibri"/>
+          <w:sz w:val="19"/>
+        </w:rPr>
+        <w:t>ad, Vocación de servicio, Innovación abierta, Transparencia de datos, Colaboración) y cuatro políticas vinculantes para resolver tensiones tecnológicas en el PETI.</w:t>
+      </w:r>
     </w:p>
     <w:p>
       <w:pPr>
         <w:pStyle w:val="Ttulo2"/>
         <w:spacing w:after="80" w:line="276" w:lineRule="auto"/>
       </w:pPr>
-      <w:bookmarkStart w:id="21" w:name="_Toc240736122"/>
-      <w:r>
-        <w:rPr>
-          <w:rFonts w:ascii="Calibri" w:hAnsi="Calibri"/>
-          <w:sz w:val="19"/>
-        </w:rPr>
-        <w:lastRenderedPageBreak/>
-        <w:t>Paso E — Formular los Valores y Redactar Secciones 2.3 y 2.4 (10 min)</w:t>
-      </w:r>
-      <w:bookmarkEnd w:id="21"/>
+      <w:bookmarkStart w:id="22" w:name="_Toc240737917"/>
+      <w:r>
+        <w:rPr>
+          <w:rFonts w:ascii="Calibri" w:hAnsi="Calibri"/>
+          <w:sz w:val="19"/>
+        </w:rPr>
+        <w:t>Paso F — Validar y Corregir (25 min)</w:t>
+      </w:r>
+      <w:bookmarkEnd w:id="22"/>
     </w:p>
     <w:p>
       <w:pPr>
@@ -3492,14 +3579,14 @@
           <w:rFonts w:ascii="Calibri" w:hAnsi="Calibri"/>
           <w:sz w:val="19"/>
         </w:rPr>
-        <w:t>Formular el marco de valores institucionales en enunciados conductuales con consecuencias disciplinarias y renuncias expresas, y redactar de forma integral la</w:t>
-      </w:r>
-      <w:r>
-        <w:rPr>
-          <w:rFonts w:ascii="Calibri" w:hAnsi="Calibri"/>
-          <w:sz w:val="19"/>
-        </w:rPr>
-        <w:t>s Secciones 2.3 y 2.4 del PETI de la MPT.</w:t>
+        <w:t>Someter los resultados a tres comprob</w:t>
+      </w:r>
+      <w:r>
+        <w:rPr>
+          <w:rFonts w:ascii="Calibri" w:hAnsi="Calibri"/>
+          <w:sz w:val="19"/>
+        </w:rPr>
+        <w:t>aciones rigurosas y corregir cualquier desviación metodológica antes del cierre de sesión.</w:t>
       </w:r>
     </w:p>
     <w:p>
@@ -3520,7 +3607,7 @@
           <w:rFonts w:ascii="Calibri" w:hAnsi="Calibri"/>
           <w:sz w:val="19"/>
         </w:rPr>
-        <w:t>Redacción de '02_identidad/2.3_valores.md' y '02_identidad/2.4_cultura.md', incorporando criterios de decisión tecnológica.</w:t>
+        <w:t>Auditoría estadística del dataset, balance dimensional y contrastación empírica con decisiones de gobierno de la MPT.</w:t>
       </w:r>
     </w:p>
     <w:p>
@@ -3534,21 +3621,61 @@
           <w:color w:val="16285C"/>
           <w:sz w:val="19"/>
         </w:rPr>
-        <w:t xml:space="preserve">• Evidencia de que funcionó: </w:t>
-      </w:r>
-      <w:r>
-        <w:rPr>
-          <w:rFonts w:ascii="Calibri" w:hAnsi="Calibri"/>
-          <w:sz w:val="19"/>
-        </w:rPr>
-        <w:t>Cinco valores institucionales conductuale</w:t>
-      </w:r>
-      <w:r>
-        <w:rPr>
-          <w:rFonts w:ascii="Calibri" w:hAnsi="Calibri"/>
-          <w:sz w:val="19"/>
-        </w:rPr>
-        <w:t>s operativos (Integridad, Vocación de servicio, Innovación abierta, Transparencia de datos, Colaboración) y cuatro políticas vinculantes para resolver tensiones tecnológicas en el PETI.</w:t>
+        <w:t>• Evidencia de que funcionó</w:t>
+      </w:r>
+      <w:r>
+        <w:rPr>
+          <w:rFonts w:ascii="Calibri" w:hAnsi="Calibri"/>
+          <w:b/>
+          <w:color w:val="16285C"/>
+          <w:sz w:val="19"/>
+        </w:rPr>
+        <w:t xml:space="preserve">: </w:t>
+      </w:r>
+      <w:r>
+        <w:rPr>
+          <w:rFonts w:ascii="Calibri" w:hAnsi="Calibri"/>
+          <w:sz w:val="19"/>
+        </w:rPr>
+        <w:t>Las tres comprobaciones resultaron plenamente satisfactorias:</w:t>
+      </w:r>
+      <w:r>
+        <w:rPr>
+          <w:rFonts w:ascii="Calibri" w:hAnsi="Calibri"/>
+          <w:sz w:val="19"/>
+        </w:rPr>
+        <w:br/>
+        <w:t>1. Comprobación 1 (Muestra multi-área): Cumplida. Participaron servidores de OGTIC (n=6), GGT (n=7), OGAF (n=6), OGACGD (n=5), GTPSC (n=5) y OGPPMI (n=3).</w:t>
+      </w:r>
+      <w:r>
+        <w:rPr>
+          <w:rFonts w:ascii="Calibri" w:hAnsi="Calibri"/>
+          <w:sz w:val="19"/>
+        </w:rPr>
+        <w:br/>
+        <w:t>2. Comprobación 2 (Suma 100 por bloqu</w:t>
+      </w:r>
+      <w:r>
+        <w:rPr>
+          <w:rFonts w:ascii="Calibri" w:hAnsi="Calibri"/>
+          <w:sz w:val="19"/>
+        </w:rPr>
+        <w:t>e): Cumplida. El algoritmo de control de calidad descartó las 3 encuestas erróneas, garantizando que el 100% de la muestra analizada sume exactamente 100 puntos.</w:t>
+      </w:r>
+      <w:r>
+        <w:rPr>
+          <w:rFonts w:ascii="Calibri" w:hAnsi="Calibri"/>
+          <w:sz w:val="19"/>
+        </w:rPr>
+        <w:br/>
+        <w:t>3. Comprobación 3 (Contrastación de mayor brecha con la realidad): Cumplida. La brecha extrema</w:t>
+      </w:r>
+      <w:r>
+        <w:rPr>
+          <w:rFonts w:ascii="Calibri" w:hAnsi="Calibri"/>
+          <w:sz w:val="19"/>
+        </w:rPr>
+        <w:t xml:space="preserve"> en Adhocracia (+21.52) coincide exactamente con la reciente aprobación del PEI 2025-2030, donde la Alta Dirección incorporó formalmente el OEI.07 ('Fortalecer el Gobierno Digital') con metas de automatización masiva de trámites (AEI.07.02).</w:t>
       </w:r>
     </w:p>
     <w:p>
@@ -3556,15 +3683,22 @@
         <w:pStyle w:val="Ttulo2"/>
         <w:spacing w:after="80" w:line="276" w:lineRule="auto"/>
       </w:pPr>
-      <w:bookmarkStart w:id="22" w:name="_Toc240736123"/>
-      <w:r>
-        <w:rPr>
-          <w:rFonts w:ascii="Calibri" w:hAnsi="Calibri"/>
-          <w:sz w:val="19"/>
-        </w:rPr>
-        <w:t>Paso F — Validar y Corregir (25 min)</w:t>
-      </w:r>
-      <w:bookmarkEnd w:id="22"/>
+      <w:bookmarkStart w:id="23" w:name="_Toc240737918"/>
+      <w:r>
+        <w:rPr>
+          <w:rFonts w:ascii="Calibri" w:hAnsi="Calibri"/>
+          <w:sz w:val="19"/>
+        </w:rPr>
+        <w:t xml:space="preserve">Paso G — </w:t>
+      </w:r>
+      <w:r>
+        <w:rPr>
+          <w:rFonts w:ascii="Calibri" w:hAnsi="Calibri"/>
+          <w:sz w:val="19"/>
+        </w:rPr>
+        <w:t>Registrar y Cerrar (15 min)</w:t>
+      </w:r>
+      <w:bookmarkEnd w:id="23"/>
     </w:p>
     <w:p>
       <w:pPr>
@@ -3584,14 +3718,7 @@
           <w:rFonts w:ascii="Calibri" w:hAnsi="Calibri"/>
           <w:sz w:val="19"/>
         </w:rPr>
-        <w:t>Someter los res</w:t>
-      </w:r>
-      <w:r>
-        <w:rPr>
-          <w:rFonts w:ascii="Calibri" w:hAnsi="Calibri"/>
-          <w:sz w:val="19"/>
-        </w:rPr>
-        <w:t>ultados a tres comprobaciones rigurosas y corregir cualquier desviación metodológica antes del cierre de sesión.</w:t>
+        <w:t>Responder la pregunta de transferencia estratégica y asegurar el versionamiento de los artefactos en el repositorio Git.</w:t>
       </w:r>
     </w:p>
     <w:p>
@@ -3612,7 +3739,14 @@
           <w:rFonts w:ascii="Calibri" w:hAnsi="Calibri"/>
           <w:sz w:val="19"/>
         </w:rPr>
-        <w:t>Auditoría estadística del dataset, balance dimensional y contrastación empírica con decisiones de gobierno de la MPT.</w:t>
+        <w:t xml:space="preserve">Respuesta argumentada y ejecución de comandos: 'git commit -m </w:t>
+      </w:r>
+      <w:r>
+        <w:rPr>
+          <w:rFonts w:ascii="Calibri" w:hAnsi="Calibri"/>
+          <w:sz w:val="19"/>
+        </w:rPr>
+        <w:t>"..."', 'git tag -a v0.5' y 'git tag -a taller-05', con push a https://github.com/GianfrancoArocutipa/Taller05_ArocutipaGIna.</w:t>
       </w:r>
     </w:p>
     <w:p>
@@ -3626,23 +3760,21 @@
           <w:color w:val="16285C"/>
           <w:sz w:val="19"/>
         </w:rPr>
-        <w:t>• Evi</w:t>
-      </w:r>
-      <w:r>
-        <w:rPr>
-          <w:rFonts w:ascii="Calibri" w:hAnsi="Calibri"/>
-          <w:b/>
-          <w:color w:val="16285C"/>
-          <w:sz w:val="19"/>
-        </w:rPr>
-        <w:t xml:space="preserve">dencia de que funcionó: </w:t>
-      </w:r>
-      <w:r>
-        <w:rPr>
-          <w:rFonts w:ascii="Calibri" w:hAnsi="Calibri"/>
-          <w:sz w:val="19"/>
-        </w:rPr>
-        <w:t>Las tres comprobaciones resultaron plenamente satisfactorias:</w:t>
+        <w:t xml:space="preserve">• Evidencia de que funcionó: </w:t>
+      </w:r>
+      <w:r>
+        <w:rPr>
+          <w:rFonts w:ascii="Calibri" w:hAnsi="Calibri"/>
+          <w:sz w:val="19"/>
+        </w:rPr>
+        <w:t xml:space="preserve">Pregunta de Transferencia: ¿Qué riesgo correría una organización real si este diagnóstico se hiciera </w:t>
+      </w:r>
+      <w:r>
+        <w:rPr>
+          <w:rFonts w:ascii="Calibri" w:hAnsi="Calibri"/>
+          <w:sz w:val="19"/>
+        </w:rPr>
+        <w:t>mal o se omitiera?</w:t>
       </w:r>
       <w:r>
         <w:rPr>
@@ -3650,7 +3782,14 @@
           <w:sz w:val="19"/>
         </w:rPr>
         <w:br/>
-        <w:t>1. Comprobación 1 (Muestra multi-área): Cumplida. Participaron servidores de OGTIC (n=6), GGT (n=7), OGAF (n=6), OGACGD (n=5), GTPSC (n=5) y OGPPMI (n=3).</w:t>
+        <w:t>«Si una municipalidad como la de Tacna omite el diagnóstico cultural o lo simula con cifras irreales, diseñará un PETI que asuma una colaboración y dinamismo inexistentes; los funcionarios rechazarán sistemáticamente el expediente digita</w:t>
+      </w:r>
+      <w:r>
+        <w:rPr>
+          <w:rFonts w:ascii="Calibri" w:hAnsi="Calibri"/>
+          <w:sz w:val="19"/>
+        </w:rPr>
+        <w:t>l e imprimirán copias para blindarse ante el OCI, transformando inversiones millonarias en plataformas tecnológicas en costosos elefantes blancos digitales».</w:t>
       </w:r>
       <w:r>
         <w:rPr>
@@ -3658,14 +3797,6 @@
           <w:sz w:val="19"/>
         </w:rPr>
         <w:br/>
-        <w:t>2. Comprobación</w:t>
-      </w:r>
-      <w:r>
-        <w:rPr>
-          <w:rFonts w:ascii="Calibri" w:hAnsi="Calibri"/>
-          <w:sz w:val="19"/>
-        </w:rPr>
-        <w:t xml:space="preserve"> 2 (Suma 100 por bloque): Cumplida. El algoritmo de control de calidad descartó las 3 encuestas erróneas, garantizando que el 100% de la muestra analizada sume exactamente 100 puntos.</w:t>
       </w:r>
       <w:r>
         <w:rPr>
@@ -3673,143 +3804,14 @@
           <w:sz w:val="19"/>
         </w:rPr>
         <w:br/>
-        <w:t>3. Comprobación 3 (Contrastación de mayor brecha con la realidad): Cumpl</w:t>
-      </w:r>
-      <w:r>
-        <w:rPr>
-          <w:rFonts w:ascii="Calibri" w:hAnsi="Calibri"/>
-          <w:sz w:val="19"/>
-        </w:rPr>
-        <w:t>ida. La brecha extrema en Adhocracia (+21.52) coincide exactamente con la reciente aprobación del PEI 2025-2030, donde la Alta Dirección incorporó formalmente el OEI.07 ('Fortalecer el Gobierno Digital') con metas de automatización masiva de trámites (AEI.</w:t>
-      </w:r>
-      <w:r>
-        <w:rPr>
-          <w:rFonts w:ascii="Calibri" w:hAnsi="Calibri"/>
-          <w:sz w:val="19"/>
-        </w:rPr>
-        <w:t>07.02).</w:t>
-      </w:r>
-    </w:p>
-    <w:p>
-      <w:pPr>
-        <w:pStyle w:val="Ttulo2"/>
-        <w:spacing w:after="80" w:line="276" w:lineRule="auto"/>
-      </w:pPr>
-      <w:bookmarkStart w:id="23" w:name="_Toc240736124"/>
-      <w:r>
-        <w:rPr>
-          <w:rFonts w:ascii="Calibri" w:hAnsi="Calibri"/>
-          <w:sz w:val="19"/>
-        </w:rPr>
-        <w:t>Paso G — Registrar y Cerrar (15 min)</w:t>
-      </w:r>
-      <w:bookmarkEnd w:id="23"/>
-    </w:p>
-    <w:p>
-      <w:pPr>
-        <w:spacing w:after="80" w:line="276" w:lineRule="auto"/>
-      </w:pPr>
-      <w:r>
-        <w:rPr>
-          <w:rFonts w:ascii="Calibri" w:hAnsi="Calibri"/>
-          <w:b/>
-          <w:color w:val="16285C"/>
-          <w:sz w:val="19"/>
-        </w:rPr>
-        <w:t xml:space="preserve">• Qué se buscaba: </w:t>
-      </w:r>
-      <w:r>
-        <w:rPr>
-          <w:rFonts w:ascii="Calibri" w:hAnsi="Calibri"/>
-          <w:sz w:val="19"/>
-        </w:rPr>
-        <w:t>Responder la pregunta de transferencia estratégica y asegurar el versionamiento de los artefactos en el repositorio Git.</w:t>
-      </w:r>
-    </w:p>
-    <w:p>
-      <w:pPr>
-        <w:spacing w:after="80" w:line="276" w:lineRule="auto"/>
-      </w:pPr>
-      <w:r>
-        <w:rPr>
-          <w:rFonts w:ascii="Calibri" w:hAnsi="Calibri"/>
-          <w:b/>
-          <w:color w:val="16285C"/>
-          <w:sz w:val="19"/>
-        </w:rPr>
-        <w:t xml:space="preserve">• Comando o acción: </w:t>
-      </w:r>
-      <w:r>
-        <w:rPr>
-          <w:rFonts w:ascii="Calibri" w:hAnsi="Calibri"/>
-          <w:sz w:val="19"/>
-        </w:rPr>
-        <w:t xml:space="preserve">Respuesta argumentada y ejecución de </w:t>
-      </w:r>
-      <w:r>
-        <w:rPr>
-          <w:rFonts w:ascii="Calibri" w:hAnsi="Calibri"/>
-          <w:sz w:val="19"/>
-        </w:rPr>
-        <w:t>comandos: 'git commit -m "..."', 'git tag -a v0.5' y 'git tag -a taller-05'.</w:t>
-      </w:r>
-    </w:p>
-    <w:p>
-      <w:pPr>
-        <w:spacing w:after="80" w:line="276" w:lineRule="auto"/>
-      </w:pPr>
-      <w:r>
-        <w:rPr>
-          <w:rFonts w:ascii="Calibri" w:hAnsi="Calibri"/>
-          <w:b/>
-          <w:color w:val="16285C"/>
-          <w:sz w:val="19"/>
-        </w:rPr>
-        <w:t xml:space="preserve">• Evidencia de que funcionó: </w:t>
-      </w:r>
-      <w:r>
-        <w:rPr>
-          <w:rFonts w:ascii="Calibri" w:hAnsi="Calibri"/>
-          <w:sz w:val="19"/>
-        </w:rPr>
-        <w:t>Pregunta de Transferencia: ¿Qué riesgo correría una organización real si este diagnóstico se hiciera mal o se omitiera?</w:t>
-      </w:r>
-      <w:r>
-        <w:rPr>
-          <w:rFonts w:ascii="Calibri" w:hAnsi="Calibri"/>
-          <w:sz w:val="19"/>
-        </w:rPr>
-        <w:br/>
-        <w:t xml:space="preserve">«Si una municipalidad como la </w:t>
-      </w:r>
-      <w:r>
-        <w:rPr>
-          <w:rFonts w:ascii="Calibri" w:hAnsi="Calibri"/>
-          <w:sz w:val="19"/>
-        </w:rPr>
-        <w:t>de Tacna omite el diagnóstico cultural o lo simula con cifras irreales, diseñará un PETI que asuma una colaboración y dinamismo inexistentes; los funcionarios rechazarán sistemáticamente el expediente digital e imprimirán copias para blindarse ante el OCI,</w:t>
-      </w:r>
-      <w:r>
-        <w:rPr>
-          <w:rFonts w:ascii="Calibri" w:hAnsi="Calibri"/>
-          <w:sz w:val="19"/>
-        </w:rPr>
-        <w:t xml:space="preserve"> transformando inversiones millonarias en plataformas tecnológicas en costosos elefantes blancos digitales».</w:t>
-      </w:r>
-      <w:r>
-        <w:rPr>
-          <w:rFonts w:ascii="Calibri" w:hAnsi="Calibri"/>
-          <w:sz w:val="19"/>
-        </w:rPr>
-        <w:br/>
-      </w:r>
-      <w:r>
-        <w:rPr>
-          <w:rFonts w:ascii="Calibri" w:hAnsi="Calibri"/>
-          <w:sz w:val="19"/>
-        </w:rPr>
-        <w:br/>
-        <w:t>Evidencia de versionamiento: Commits registrados y etiquetas 'v0.5' y 'taller-05' verificables en 'docs/evidencias/S05/salidas/git_log.txt'.</w:t>
+        <w:t>Evidencia de versionamiento en GitHub: Commits y etiquetas 'v0.5' y 'taller-05' accesibles en htt</w:t>
+      </w:r>
+      <w:r>
+        <w:rPr>
+          <w:rFonts w:ascii="Calibri" w:hAnsi="Calibri"/>
+          <w:sz w:val="19"/>
+        </w:rPr>
+        <w:t>ps://github.com/GianfrancoArocutipa/Taller05_ArocutipaGIna/tree/taller-05 y salidas en https://github.com/GianfrancoArocutipa/Taller05_ArocutipaGIna/tree/taller-05/docs/evidencias/S05/salidas/git_log.txt.</w:t>
       </w:r>
     </w:p>
     <w:tbl>
@@ -3824,14 +3826,14 @@
         <w:tblLook w:val="04A0" w:firstRow="1" w:lastRow="0" w:firstColumn="1" w:lastColumn="0" w:noHBand="0" w:noVBand="1"/>
       </w:tblPr>
       <w:tblGrid>
-        <w:gridCol w:w="1441"/>
-        <w:gridCol w:w="225"/>
-        <w:gridCol w:w="1782"/>
-        <w:gridCol w:w="1338"/>
-        <w:gridCol w:w="245"/>
-        <w:gridCol w:w="1422"/>
-        <w:gridCol w:w="967"/>
-        <w:gridCol w:w="2214"/>
+        <w:gridCol w:w="1243"/>
+        <w:gridCol w:w="101"/>
+        <w:gridCol w:w="1375"/>
+        <w:gridCol w:w="428"/>
+        <w:gridCol w:w="892"/>
+        <w:gridCol w:w="554"/>
+        <w:gridCol w:w="1753"/>
+        <w:gridCol w:w="3288"/>
       </w:tblGrid>
       <w:tr>
         <w:trPr>
@@ -3860,8 +3862,26 @@
                 <w:color w:val="FFFFFF"/>
                 <w:sz w:val="17"/>
               </w:rPr>
-              <w:t>Halla</w:t>
-            </w:r>
+              <w:t>Hallazgo Cultural</w:t>
+            </w:r>
+          </w:p>
+        </w:tc>
+        <w:tc>
+          <w:tcPr>
+            <w:tcW w:w="3744" w:type="dxa"/>
+            <w:gridSpan w:val="2"/>
+            <w:shd w:val="clear" w:color="auto" w:fill="16285C"/>
+            <w:tcMar>
+              <w:top w:w="100" w:type="dxa"/>
+              <w:left w:w="140" w:type="dxa"/>
+              <w:bottom w:w="100" w:type="dxa"/>
+              <w:right w:w="140" w:type="dxa"/>
+            </w:tcMar>
+          </w:tcPr>
+          <w:p>
+            <w:pPr>
+              <w:spacing w:before="40" w:after="40" w:line="276" w:lineRule="auto"/>
+            </w:pPr>
             <w:r>
               <w:rPr>
                 <w:rFonts w:ascii="Calibri" w:hAnsi="Calibri"/>
@@ -3869,13 +3889,13 @@
                 <w:color w:val="FFFFFF"/>
                 <w:sz w:val="17"/>
               </w:rPr>
-              <w:t>zgo Cultural</w:t>
-            </w:r>
-          </w:p>
-        </w:tc>
-        <w:tc>
-          <w:tcPr>
-            <w:tcW w:w="4608" w:type="dxa"/>
+              <w:t>Riesgo Concreto para el PETI</w:t>
+            </w:r>
+          </w:p>
+        </w:tc>
+        <w:tc>
+          <w:tcPr>
+            <w:tcW w:w="1296" w:type="dxa"/>
             <w:gridSpan w:val="2"/>
             <w:shd w:val="clear" w:color="auto" w:fill="16285C"/>
             <w:tcMar>
@@ -3896,26 +3916,8 @@
                 <w:color w:val="FFFFFF"/>
                 <w:sz w:val="17"/>
               </w:rPr>
-              <w:t>Riesgo Concreto para el PETI</w:t>
-            </w:r>
-          </w:p>
-        </w:tc>
-        <w:tc>
-          <w:tcPr>
-            <w:tcW w:w="1440" w:type="dxa"/>
-            <w:gridSpan w:val="2"/>
-            <w:shd w:val="clear" w:color="auto" w:fill="16285C"/>
-            <w:tcMar>
-              <w:top w:w="100" w:type="dxa"/>
-              <w:left w:w="140" w:type="dxa"/>
-              <w:bottom w:w="100" w:type="dxa"/>
-              <w:right w:w="140" w:type="dxa"/>
-            </w:tcMar>
-          </w:tcPr>
-          <w:p>
-            <w:pPr>
-              <w:spacing w:before="40" w:after="40" w:line="276" w:lineRule="auto"/>
-            </w:pPr>
+              <w:t>Estr</w:t>
+            </w:r>
             <w:r>
               <w:rPr>
                 <w:rFonts w:ascii="Calibri" w:hAnsi="Calibri"/>
@@ -3923,13 +3925,13 @@
                 <w:color w:val="FFFFFF"/>
                 <w:sz w:val="17"/>
               </w:rPr>
-              <w:t>Estrategia de Implantación Adoptada</w:t>
-            </w:r>
-          </w:p>
-        </w:tc>
-        <w:tc>
-          <w:tcPr>
-            <w:tcW w:w="3456" w:type="dxa"/>
+              <w:t>ategia de Implantación Adoptada</w:t>
+            </w:r>
+          </w:p>
+        </w:tc>
+        <w:tc>
+          <w:tcPr>
+            <w:tcW w:w="4464" w:type="dxa"/>
             <w:gridSpan w:val="2"/>
             <w:shd w:val="clear" w:color="auto" w:fill="16285C"/>
             <w:tcMar>
@@ -3980,7 +3982,7 @@
               <w:rPr>
                 <w:rFonts w:ascii="Calibri" w:hAnsi="Calibri"/>
                 <w:color w:val="000000"/>
-                <w:sz w:val="16"/>
+                <w:sz w:val="15"/>
               </w:rPr>
               <w:t>1</w:t>
             </w:r>
@@ -4006,7 +4008,7 @@
               <w:rPr>
                 <w:rFonts w:ascii="Calibri" w:hAnsi="Calibri"/>
                 <w:color w:val="000000"/>
-                <w:sz w:val="16"/>
+                <w:sz w:val="15"/>
               </w:rPr>
               <w:t>Instrumento CVF con 6 dimensiones y 2 momentos</w:t>
             </w:r>
@@ -4034,7 +4036,7 @@
                 <w:rFonts w:ascii="Calibri" w:hAnsi="Calibri"/>
                 <w:b/>
                 <w:color w:val="15803D"/>
-                <w:sz w:val="16"/>
+                <w:sz w:val="15"/>
               </w:rPr>
               <w:t>LOGRADO</w:t>
             </w:r>
@@ -4060,9 +4062,9 @@
               <w:rPr>
                 <w:rFonts w:ascii="Calibri" w:hAnsi="Calibri"/>
                 <w:color w:val="000000"/>
-                <w:sz w:val="16"/>
-              </w:rPr>
-              <w:t>02_identidad/CU01_instrumento.md</w:t>
+                <w:sz w:val="15"/>
+              </w:rPr>
+              <w:t>https://github.com/GianfrancoArocutipa/Taller05_ArocutipaGIna/tree/taller-05/02_identidad/CU01_instrumento.md</w:t>
             </w:r>
           </w:p>
         </w:tc>
@@ -4092,7 +4094,7 @@
               <w:rPr>
                 <w:rFonts w:ascii="Calibri" w:hAnsi="Calibri"/>
                 <w:color w:val="000000"/>
-                <w:sz w:val="16"/>
+                <w:sz w:val="15"/>
               </w:rPr>
               <w:t>2</w:t>
             </w:r>
@@ -4118,9 +4120,17 @@
               <w:rPr>
                 <w:rFonts w:ascii="Calibri" w:hAnsi="Calibri"/>
                 <w:color w:val="000000"/>
-                <w:sz w:val="16"/>
-              </w:rPr>
-              <w:t>Al menos 10 respondientes de diversas áreas</w:t>
+                <w:sz w:val="15"/>
+              </w:rPr>
+              <w:t xml:space="preserve">Al menos 10 </w:t>
+            </w:r>
+            <w:r>
+              <w:rPr>
+                <w:rFonts w:ascii="Calibri" w:hAnsi="Calibri"/>
+                <w:color w:val="000000"/>
+                <w:sz w:val="15"/>
+              </w:rPr>
+              <w:t>respondientes de diversas áreas</w:t>
             </w:r>
           </w:p>
         </w:tc>
@@ -4146,7 +4156,7 @@
                 <w:rFonts w:ascii="Calibri" w:hAnsi="Calibri"/>
                 <w:b/>
                 <w:color w:val="15803D"/>
-                <w:sz w:val="16"/>
+                <w:sz w:val="15"/>
               </w:rPr>
               <w:t>LOGRADO</w:t>
             </w:r>
@@ -4172,17 +4182,9 @@
               <w:rPr>
                 <w:rFonts w:ascii="Calibri" w:hAnsi="Calibri"/>
                 <w:color w:val="000000"/>
-                <w:sz w:val="16"/>
-              </w:rPr>
-              <w:t xml:space="preserve">N=35 en </w:t>
-            </w:r>
-            <w:r>
-              <w:rPr>
-                <w:rFonts w:ascii="Calibri" w:hAnsi="Calibri"/>
-                <w:color w:val="000000"/>
-                <w:sz w:val="16"/>
-              </w:rPr>
-              <w:t>02_identidad/encuesta_cultura.csv</w:t>
+                <w:sz w:val="15"/>
+              </w:rPr>
+              <w:t>N=35 en https://github.com/GianfrancoArocutipa/Taller05_ArocutipaGIna/tree/taller-05/02_identidad/encuesta_cultura.csv</w:t>
             </w:r>
           </w:p>
         </w:tc>
@@ -4212,7 +4214,7 @@
               <w:rPr>
                 <w:rFonts w:ascii="Calibri" w:hAnsi="Calibri"/>
                 <w:color w:val="000000"/>
-                <w:sz w:val="16"/>
+                <w:sz w:val="15"/>
               </w:rPr>
               <w:t>3</w:t>
             </w:r>
@@ -4238,7 +4240,7 @@
               <w:rPr>
                 <w:rFonts w:ascii="Calibri" w:hAnsi="Calibri"/>
                 <w:color w:val="000000"/>
-                <w:sz w:val="16"/>
+                <w:sz w:val="15"/>
               </w:rPr>
               <w:t>Control de calidad ejecutado (exclusión sumas != 100)</w:t>
             </w:r>
@@ -4266,7 +4268,7 @@
                 <w:rFonts w:ascii="Calibri" w:hAnsi="Calibri"/>
                 <w:b/>
                 <w:color w:val="15803D"/>
-                <w:sz w:val="16"/>
+                <w:sz w:val="15"/>
               </w:rPr>
               <w:t>LOGRADO</w:t>
             </w:r>
@@ -4292,9 +4294,9 @@
               <w:rPr>
                 <w:rFonts w:ascii="Calibri" w:hAnsi="Calibri"/>
                 <w:color w:val="000000"/>
-                <w:sz w:val="16"/>
-              </w:rPr>
-              <w:t>salidas/control_calidad.txt (3 excluidos)</w:t>
+                <w:sz w:val="15"/>
+              </w:rPr>
+              <w:t>https://github.com/GianfrancoArocutipa/Taller05_ArocutipaGIna/tree/taller-05/docs/evidencias/S05/salidas/control_calidad.txt</w:t>
             </w:r>
           </w:p>
         </w:tc>
@@ -4324,7 +4326,7 @@
               <w:rPr>
                 <w:rFonts w:ascii="Calibri" w:hAnsi="Calibri"/>
                 <w:color w:val="000000"/>
-                <w:sz w:val="16"/>
+                <w:sz w:val="15"/>
               </w:rPr>
               <w:lastRenderedPageBreak/>
               <w:t>4</w:t>
@@ -4351,7 +4353,7 @@
               <w:rPr>
                 <w:rFonts w:ascii="Calibri" w:hAnsi="Calibri"/>
                 <w:color w:val="000000"/>
-                <w:sz w:val="16"/>
+                <w:sz w:val="15"/>
               </w:rPr>
               <w:t>Perfil de cultura actual y deseada con brechas</w:t>
             </w:r>
@@ -4379,7 +4381,7 @@
                 <w:rFonts w:ascii="Calibri" w:hAnsi="Calibri"/>
                 <w:b/>
                 <w:color w:val="15803D"/>
-                <w:sz w:val="16"/>
+                <w:sz w:val="15"/>
               </w:rPr>
               <w:t>LOGRADO</w:t>
             </w:r>
@@ -4405,9 +4407,9 @@
               <w:rPr>
                 <w:rFonts w:ascii="Calibri" w:hAnsi="Calibri"/>
                 <w:color w:val="000000"/>
-                <w:sz w:val="16"/>
-              </w:rPr>
-              <w:t>02_identidad/CU02_perfil_cultura.csv</w:t>
+                <w:sz w:val="15"/>
+              </w:rPr>
+              <w:t>https://github.com/GianfrancoArocutipa/Taller05_ArocutipaGIna/tree/taller-05/02_identidad/CU02_perfil_cultura.csv</w:t>
             </w:r>
           </w:p>
         </w:tc>
@@ -4437,7 +4439,7 @@
               <w:rPr>
                 <w:rFonts w:ascii="Calibri" w:hAnsi="Calibri"/>
                 <w:color w:val="000000"/>
-                <w:sz w:val="16"/>
+                <w:sz w:val="15"/>
               </w:rPr>
               <w:t>5</w:t>
             </w:r>
@@ -4463,7 +4465,7 @@
               <w:rPr>
                 <w:rFonts w:ascii="Calibri" w:hAnsi="Calibri"/>
                 <w:color w:val="000000"/>
-                <w:sz w:val="16"/>
+                <w:sz w:val="15"/>
               </w:rPr>
               <w:t>Cultura dominante y deseada identificadas</w:t>
             </w:r>
@@ -4491,7 +4493,7 @@
                 <w:rFonts w:ascii="Calibri" w:hAnsi="Calibri"/>
                 <w:b/>
                 <w:color w:val="15803D"/>
-                <w:sz w:val="16"/>
+                <w:sz w:val="15"/>
               </w:rPr>
               <w:t>LOGRADO</w:t>
             </w:r>
@@ -4517,7 +4519,7 @@
               <w:rPr>
                 <w:rFonts w:ascii="Calibri" w:hAnsi="Calibri"/>
                 <w:color w:val="000000"/>
-                <w:sz w:val="16"/>
+                <w:sz w:val="15"/>
               </w:rPr>
               <w:t>Actual: Jerarquía (44.10) | Deseada: Adhoc (34.14)</w:t>
             </w:r>
@@ -4549,7 +4551,7 @@
               <w:rPr>
                 <w:rFonts w:ascii="Calibri" w:hAnsi="Calibri"/>
                 <w:color w:val="000000"/>
-                <w:sz w:val="16"/>
+                <w:sz w:val="15"/>
               </w:rPr>
               <w:t>6</w:t>
             </w:r>
@@ -4575,9 +4577,17 @@
               <w:rPr>
                 <w:rFonts w:ascii="Calibri" w:hAnsi="Calibri"/>
                 <w:color w:val="000000"/>
-                <w:sz w:val="16"/>
-              </w:rPr>
-              <w:t>Análisis de congruencia dimensional con veredicto</w:t>
+                <w:sz w:val="15"/>
+              </w:rPr>
+              <w:t xml:space="preserve">Análisis de congruencia </w:t>
+            </w:r>
+            <w:r>
+              <w:rPr>
+                <w:rFonts w:ascii="Calibri" w:hAnsi="Calibri"/>
+                <w:color w:val="000000"/>
+                <w:sz w:val="15"/>
+              </w:rPr>
+              <w:t>dimensional con veredicto</w:t>
             </w:r>
           </w:p>
         </w:tc>
@@ -4603,7 +4613,7 @@
                 <w:rFonts w:ascii="Calibri" w:hAnsi="Calibri"/>
                 <w:b/>
                 <w:color w:val="15803D"/>
-                <w:sz w:val="16"/>
+                <w:sz w:val="15"/>
               </w:rPr>
               <w:t>LOGRADO</w:t>
             </w:r>
@@ -4629,17 +4639,9 @@
               <w:rPr>
                 <w:rFonts w:ascii="Calibri" w:hAnsi="Calibri"/>
                 <w:color w:val="000000"/>
-                <w:sz w:val="16"/>
-              </w:rPr>
-              <w:t xml:space="preserve">Veredicto: ALTA CONGRUENCIA (6 </w:t>
-            </w:r>
-            <w:r>
-              <w:rPr>
-                <w:rFonts w:ascii="Calibri" w:hAnsi="Calibri"/>
-                <w:color w:val="000000"/>
-                <w:sz w:val="16"/>
-              </w:rPr>
-              <w:t>dimensiones)</w:t>
+                <w:sz w:val="15"/>
+              </w:rPr>
+              <w:t>Veredicto: ALTA CONGRUENCIA (6 dimensiones)</w:t>
             </w:r>
           </w:p>
         </w:tc>
@@ -4669,7 +4671,7 @@
               <w:rPr>
                 <w:rFonts w:ascii="Calibri" w:hAnsi="Calibri"/>
                 <w:color w:val="000000"/>
-                <w:sz w:val="16"/>
+                <w:sz w:val="15"/>
               </w:rPr>
               <w:t>7</w:t>
             </w:r>
@@ -4695,7 +4697,7 @@
               <w:rPr>
                 <w:rFonts w:ascii="Calibri" w:hAnsi="Calibri"/>
                 <w:color w:val="000000"/>
-                <w:sz w:val="16"/>
+                <w:sz w:val="15"/>
               </w:rPr>
               <w:t>Perfil por área funcional (áreas con n &gt;= 5)</w:t>
             </w:r>
@@ -4723,7 +4725,7 @@
                 <w:rFonts w:ascii="Calibri" w:hAnsi="Calibri"/>
                 <w:b/>
                 <w:color w:val="15803D"/>
-                <w:sz w:val="16"/>
+                <w:sz w:val="15"/>
               </w:rPr>
               <w:t>LOGRADO</w:t>
             </w:r>
@@ -4749,9 +4751,9 @@
               <w:rPr>
                 <w:rFonts w:ascii="Calibri" w:hAnsi="Calibri"/>
                 <w:color w:val="000000"/>
-                <w:sz w:val="16"/>
-              </w:rPr>
-              <w:t>OGTIC, GGT, OGAF, OGACGD, GTPSC analizadas</w:t>
+                <w:sz w:val="15"/>
+              </w:rPr>
+              <w:t>https://github.com/GianfrancoArocutipa/Taller05_ArocutipaGIna/tree/taller-05/docs/evidencias/S05/salidas/analisis_perfil.txt</w:t>
             </w:r>
           </w:p>
         </w:tc>
@@ -4781,7 +4783,7 @@
               <w:rPr>
                 <w:rFonts w:ascii="Calibri" w:hAnsi="Calibri"/>
                 <w:color w:val="000000"/>
-                <w:sz w:val="16"/>
+                <w:sz w:val="15"/>
               </w:rPr>
               <w:t>8</w:t>
             </w:r>
@@ -4807,7 +4809,7 @@
               <w:rPr>
                 <w:rFonts w:ascii="Calibri" w:hAnsi="Calibri"/>
                 <w:color w:val="000000"/>
-                <w:sz w:val="16"/>
+                <w:sz w:val="15"/>
               </w:rPr>
               <w:t>Gráfico de radar generado en alta resolución</w:t>
             </w:r>
@@ -4835,7 +4837,7 @@
                 <w:rFonts w:ascii="Calibri" w:hAnsi="Calibri"/>
                 <w:b/>
                 <w:color w:val="15803D"/>
-                <w:sz w:val="16"/>
+                <w:sz w:val="15"/>
               </w:rPr>
               <w:t>LOGRADO</w:t>
             </w:r>
@@ -4861,9 +4863,9 @@
               <w:rPr>
                 <w:rFonts w:ascii="Calibri" w:hAnsi="Calibri"/>
                 <w:color w:val="000000"/>
-                <w:sz w:val="16"/>
-              </w:rPr>
-              <w:t>02_identidad/CU_perfil_cultura.png</w:t>
+                <w:sz w:val="15"/>
+              </w:rPr>
+              <w:t>https://github.com/GianfrancoArocutipa/Taller05_ArocutipaGIna/tree/taller-05/02_identidad/CU_perfil_cultura.png</w:t>
             </w:r>
           </w:p>
         </w:tc>
@@ -4893,7 +4895,7 @@
               <w:rPr>
                 <w:rFonts w:ascii="Calibri" w:hAnsi="Calibri"/>
                 <w:color w:val="000000"/>
-                <w:sz w:val="16"/>
+                <w:sz w:val="15"/>
               </w:rPr>
               <w:t>9</w:t>
             </w:r>
@@ -4919,17 +4921,9 @@
               <w:rPr>
                 <w:rFonts w:ascii="Calibri" w:hAnsi="Calibri"/>
                 <w:color w:val="000000"/>
-                <w:sz w:val="16"/>
-              </w:rPr>
-              <w:t xml:space="preserve">Al menos 5 supuestos básicos inferidos con </w:t>
-            </w:r>
-            <w:r>
-              <w:rPr>
-                <w:rFonts w:ascii="Calibri" w:hAnsi="Calibri"/>
-                <w:color w:val="000000"/>
-                <w:sz w:val="16"/>
-              </w:rPr>
-              <w:t>evidencia</w:t>
+                <w:sz w:val="15"/>
+              </w:rPr>
+              <w:t>Al menos 5 supuestos básicos inferidos con evidencia</w:t>
             </w:r>
           </w:p>
         </w:tc>
@@ -4955,7 +4949,7 @@
                 <w:rFonts w:ascii="Calibri" w:hAnsi="Calibri"/>
                 <w:b/>
                 <w:color w:val="15803D"/>
-                <w:sz w:val="16"/>
+                <w:sz w:val="15"/>
               </w:rPr>
               <w:t>LOGRADO</w:t>
             </w:r>
@@ -4981,9 +4975,17 @@
               <w:rPr>
                 <w:rFonts w:ascii="Calibri" w:hAnsi="Calibri"/>
                 <w:color w:val="000000"/>
-                <w:sz w:val="16"/>
-              </w:rPr>
-              <w:t>6 supuestos en 02_identidad/CU03_supuestos.csv</w:t>
+                <w:sz w:val="15"/>
+              </w:rPr>
+              <w:t xml:space="preserve">6 supuestos en </w:t>
+            </w:r>
+            <w:r>
+              <w:rPr>
+                <w:rFonts w:ascii="Calibri" w:hAnsi="Calibri"/>
+                <w:color w:val="000000"/>
+                <w:sz w:val="15"/>
+              </w:rPr>
+              <w:t>https://github.com/GianfrancoArocutipa/Taller05_ArocutipaGIna/tree/taller-05/02_identidad/CU03_supuestos.csv</w:t>
             </w:r>
           </w:p>
         </w:tc>
@@ -5013,7 +5015,7 @@
               <w:rPr>
                 <w:rFonts w:ascii="Calibri" w:hAnsi="Calibri"/>
                 <w:color w:val="000000"/>
-                <w:sz w:val="16"/>
+                <w:sz w:val="15"/>
               </w:rPr>
               <w:t>10</w:t>
             </w:r>
@@ -5039,7 +5041,7 @@
               <w:rPr>
                 <w:rFonts w:ascii="Calibri" w:hAnsi="Calibri"/>
                 <w:color w:val="000000"/>
-                <w:sz w:val="16"/>
+                <w:sz w:val="15"/>
               </w:rPr>
               <w:t>Al menos 3 brechas entre valor adoptado y supuesto</w:t>
             </w:r>
@@ -5067,7 +5069,7 @@
                 <w:rFonts w:ascii="Calibri" w:hAnsi="Calibri"/>
                 <w:b/>
                 <w:color w:val="15803D"/>
-                <w:sz w:val="16"/>
+                <w:sz w:val="15"/>
               </w:rPr>
               <w:t>LOGRADO</w:t>
             </w:r>
@@ -5093,9 +5095,17 @@
               <w:rPr>
                 <w:rFonts w:ascii="Calibri" w:hAnsi="Calibri"/>
                 <w:color w:val="000000"/>
-                <w:sz w:val="16"/>
-              </w:rPr>
-              <w:t>5 brechas demostradas en CU03_supuestos.csv</w:t>
+                <w:sz w:val="15"/>
+              </w:rPr>
+              <w:t xml:space="preserve">5 brechas en </w:t>
+            </w:r>
+            <w:r>
+              <w:rPr>
+                <w:rFonts w:ascii="Calibri" w:hAnsi="Calibri"/>
+                <w:color w:val="000000"/>
+                <w:sz w:val="15"/>
+              </w:rPr>
+              <w:t>https://github.com/GianfrancoArocutipa/Taller05_ArocutipaGIna/tree/taller-05/02_identidad/CU03_supuestos.csv</w:t>
             </w:r>
           </w:p>
         </w:tc>
@@ -5125,7 +5135,7 @@
               <w:rPr>
                 <w:rFonts w:ascii="Calibri" w:hAnsi="Calibri"/>
                 <w:color w:val="000000"/>
-                <w:sz w:val="16"/>
+                <w:sz w:val="15"/>
               </w:rPr>
               <w:t>11</w:t>
             </w:r>
@@ -5151,7 +5161,7 @@
               <w:rPr>
                 <w:rFonts w:ascii="Calibri" w:hAnsi="Calibri"/>
                 <w:color w:val="000000"/>
-                <w:sz w:val="16"/>
+                <w:sz w:val="15"/>
               </w:rPr>
               <w:t>Tabla de implicancias con estrategia de implantación</w:t>
             </w:r>
@@ -5179,7 +5189,7 @@
                 <w:rFonts w:ascii="Calibri" w:hAnsi="Calibri"/>
                 <w:b/>
                 <w:color w:val="15803D"/>
-                <w:sz w:val="16"/>
+                <w:sz w:val="15"/>
               </w:rPr>
               <w:t>LOGRADO</w:t>
             </w:r>
@@ -5205,9 +5215,9 @@
               <w:rPr>
                 <w:rFonts w:ascii="Calibri" w:hAnsi="Calibri"/>
                 <w:color w:val="000000"/>
-                <w:sz w:val="16"/>
-              </w:rPr>
-              <w:t>02_identidad/CU04_implicancias_peti.md</w:t>
+                <w:sz w:val="15"/>
+              </w:rPr>
+              <w:t>https://github.com/GianfrancoArocutipa/Taller05_ArocutipaGIna/tree/taller-05/02_identidad/CU04_implicancias_peti.md</w:t>
             </w:r>
           </w:p>
         </w:tc>
@@ -5237,7 +5247,7 @@
               <w:rPr>
                 <w:rFonts w:ascii="Calibri" w:hAnsi="Calibri"/>
                 <w:color w:val="000000"/>
-                <w:sz w:val="16"/>
+                <w:sz w:val="15"/>
               </w:rPr>
               <w:t>12</w:t>
             </w:r>
@@ -5263,7 +5273,7 @@
               <w:rPr>
                 <w:rFonts w:ascii="Calibri" w:hAnsi="Calibri"/>
                 <w:color w:val="000000"/>
-                <w:sz w:val="16"/>
+                <w:sz w:val="15"/>
               </w:rPr>
               <w:t>Valores formulados como conductas con consecuencias</w:t>
             </w:r>
@@ -5291,7 +5301,7 @@
                 <w:rFonts w:ascii="Calibri" w:hAnsi="Calibri"/>
                 <w:b/>
                 <w:color w:val="15803D"/>
-                <w:sz w:val="16"/>
+                <w:sz w:val="15"/>
               </w:rPr>
               <w:t>LOGRADO</w:t>
             </w:r>
@@ -5317,9 +5327,17 @@
               <w:rPr>
                 <w:rFonts w:ascii="Calibri" w:hAnsi="Calibri"/>
                 <w:color w:val="000000"/>
-                <w:sz w:val="16"/>
-              </w:rPr>
-              <w:t>5 valores conductuales en 02_identidad/2.3_valores.md</w:t>
+                <w:sz w:val="15"/>
+              </w:rPr>
+              <w:t xml:space="preserve">5 valores en </w:t>
+            </w:r>
+            <w:r>
+              <w:rPr>
+                <w:rFonts w:ascii="Calibri" w:hAnsi="Calibri"/>
+                <w:color w:val="000000"/>
+                <w:sz w:val="15"/>
+              </w:rPr>
+              <w:t>https://github.com/GianfrancoArocutipa/Taller05_ArocutipaGIna/tree/taller-05/02_identidad/2.3_valores.md</w:t>
             </w:r>
           </w:p>
         </w:tc>
@@ -5349,7 +5367,7 @@
               <w:rPr>
                 <w:rFonts w:ascii="Calibri" w:hAnsi="Calibri"/>
                 <w:color w:val="000000"/>
-                <w:sz w:val="16"/>
+                <w:sz w:val="15"/>
               </w:rPr>
               <w:t>13</w:t>
             </w:r>
@@ -5375,7 +5393,7 @@
               <w:rPr>
                 <w:rFonts w:ascii="Calibri" w:hAnsi="Calibri"/>
                 <w:color w:val="000000"/>
-                <w:sz w:val="16"/>
+                <w:sz w:val="15"/>
               </w:rPr>
               <w:t>Valor que gobierna decisión tecnológica concreta</w:t>
             </w:r>
@@ -5403,7 +5421,7 @@
                 <w:rFonts w:ascii="Calibri" w:hAnsi="Calibri"/>
                 <w:b/>
                 <w:color w:val="15803D"/>
-                <w:sz w:val="16"/>
+                <w:sz w:val="15"/>
               </w:rPr>
               <w:t>LOGRADO</w:t>
             </w:r>
@@ -5429,17 +5447,9 @@
               <w:rPr>
                 <w:rFonts w:ascii="Calibri" w:hAnsi="Calibri"/>
                 <w:color w:val="000000"/>
-                <w:sz w:val="16"/>
-              </w:rPr>
-              <w:t xml:space="preserve">4 tensiones y criterios TI en </w:t>
-            </w:r>
-            <w:r>
-              <w:rPr>
-                <w:rFonts w:ascii="Calibri" w:hAnsi="Calibri"/>
-                <w:color w:val="000000"/>
-                <w:sz w:val="16"/>
-              </w:rPr>
-              <w:t>Sección 2.3.2</w:t>
+                <w:sz w:val="15"/>
+              </w:rPr>
+              <w:t>4 tensiones y criterios TI en Sección 2.3.2</w:t>
             </w:r>
           </w:p>
         </w:tc>
@@ -5469,7 +5479,7 @@
               <w:rPr>
                 <w:rFonts w:ascii="Calibri" w:hAnsi="Calibri"/>
                 <w:color w:val="000000"/>
-                <w:sz w:val="16"/>
+                <w:sz w:val="15"/>
               </w:rPr>
               <w:t>14</w:t>
             </w:r>
@@ -5495,9 +5505,17 @@
               <w:rPr>
                 <w:rFonts w:ascii="Calibri" w:hAnsi="Calibri"/>
                 <w:color w:val="000000"/>
-                <w:sz w:val="16"/>
-              </w:rPr>
-              <w:t>Secciones 2.3 y 2.4 redactadas y etiqueta v0.5</w:t>
+                <w:sz w:val="15"/>
+              </w:rPr>
+              <w:t xml:space="preserve">Secciones 2.3 y 2.4 redactadas y </w:t>
+            </w:r>
+            <w:r>
+              <w:rPr>
+                <w:rFonts w:ascii="Calibri" w:hAnsi="Calibri"/>
+                <w:color w:val="000000"/>
+                <w:sz w:val="15"/>
+              </w:rPr>
+              <w:t>etiqueta v0.5</w:t>
             </w:r>
           </w:p>
         </w:tc>
@@ -5523,7 +5541,7 @@
                 <w:rFonts w:ascii="Calibri" w:hAnsi="Calibri"/>
                 <w:b/>
                 <w:color w:val="15803D"/>
-                <w:sz w:val="16"/>
+                <w:sz w:val="15"/>
               </w:rPr>
               <w:t>LOGRADO</w:t>
             </w:r>
@@ -5549,9 +5567,9 @@
               <w:rPr>
                 <w:rFonts w:ascii="Calibri" w:hAnsi="Calibri"/>
                 <w:color w:val="000000"/>
-                <w:sz w:val="16"/>
-              </w:rPr>
-              <w:t>Etiquetas v0.5 y taller-05 creadas en Git</w:t>
+                <w:sz w:val="15"/>
+              </w:rPr>
+              <w:t>Tags v0.5 y taller-05 en https://github.com/GianfrancoArocutipa/Taller05_ArocutipaGIna/tags</w:t>
             </w:r>
           </w:p>
         </w:tc>
@@ -5746,7 +5764,7 @@
                 <w:color w:val="000000"/>
                 <w:sz w:val="15"/>
               </w:rPr>
-              <w:t xml:space="preserve">Trámite de compras de </w:t>
+              <w:t xml:space="preserve">Trámite de compras de TI </w:t>
             </w:r>
             <w:r>
               <w:rPr>
@@ -5754,7 +5772,7 @@
                 <w:color w:val="000000"/>
                 <w:sz w:val="15"/>
               </w:rPr>
-              <w:t>TI exige de 4 a 7 firmas físicas y sellos correlativos en papel (ROF / RISST Art. 12).</w:t>
+              <w:t>exige de 4 a 7 firmas físicas y sellos correlativos en papel (ROF / RISST Art. 12).</w:t>
             </w:r>
           </w:p>
         </w:tc>
@@ -5890,7 +5908,16 @@
                 <w:color w:val="000000"/>
                 <w:sz w:val="15"/>
               </w:rPr>
-              <w:t>Sistemas tributarios y catastro operan en silos aislados; el vecino traslada copias impresas entre oficinas (PEI OEI.02).</w:t>
+              <w:t xml:space="preserve">Sistemas tributarios y catastro operan en silos aislados; el vecino traslada copias impresas </w:t>
+            </w:r>
+            <w:r>
+              <w:rPr>
+                <w:rFonts w:ascii="Calibri" w:hAnsi="Calibri"/>
+                <w:color w:val="000000"/>
+                <w:sz w:val="15"/>
+              </w:rPr>
+              <w:lastRenderedPageBreak/>
+              <w:t>entre oficinas (PEI OEI.02).</w:t>
             </w:r>
           </w:p>
         </w:tc>
@@ -5916,6 +5943,7 @@
                 <w:color w:val="000000"/>
                 <w:sz w:val="15"/>
               </w:rPr>
+              <w:lastRenderedPageBreak/>
               <w:t>Vocación de servicio y trabajo en equipo</w:t>
             </w:r>
           </w:p>
@@ -6178,16 +6206,7 @@
                 <w:color w:val="000000"/>
                 <w:sz w:val="15"/>
               </w:rPr>
-              <w:t xml:space="preserve">RISST 2024 tipifica minuciosamente sanciones; registros de incidentes </w:t>
-            </w:r>
-            <w:r>
-              <w:rPr>
-                <w:rFonts w:ascii="Calibri" w:hAnsi="Calibri"/>
-                <w:color w:val="000000"/>
-                <w:sz w:val="15"/>
-              </w:rPr>
-              <w:lastRenderedPageBreak/>
-              <w:t>presentan subreporte sistemático.</w:t>
+              <w:t>RISST 2024 tipifica minuciosamente sanciones; registros de incidentes presentan subreporte sistemático.</w:t>
             </w:r>
           </w:p>
         </w:tc>
@@ -6213,7 +6232,6 @@
                 <w:color w:val="000000"/>
                 <w:sz w:val="15"/>
               </w:rPr>
-              <w:lastRenderedPageBreak/>
               <w:t>Cuidado integral y mejora continua</w:t>
             </w:r>
           </w:p>
@@ -6248,16 +6266,7 @@
                 <w:color w:val="000000"/>
                 <w:sz w:val="15"/>
               </w:rPr>
-              <w:t xml:space="preserve">operacional acarrea investigación punitiva </w:t>
-            </w:r>
-            <w:r>
-              <w:rPr>
-                <w:rFonts w:ascii="Calibri" w:hAnsi="Calibri"/>
-                <w:color w:val="000000"/>
-                <w:sz w:val="15"/>
-              </w:rPr>
-              <w:lastRenderedPageBreak/>
-              <w:t>antes que aprendizaje.</w:t>
+              <w:t>operacional acarrea investigación punitiva antes que aprendizaje.</w:t>
             </w:r>
           </w:p>
         </w:tc>
@@ -6284,7 +6293,6 @@
                 <w:color w:val="B91C1C"/>
                 <w:sz w:val="15"/>
               </w:rPr>
-              <w:lastRenderedPageBreak/>
               <w:t>NO</w:t>
             </w:r>
           </w:p>
@@ -7275,9 +7283,10 @@
         <w:pStyle w:val="Ttulo1"/>
       </w:pPr>
       <w:bookmarkStart w:id="24" w:name="resultados"/>
-      <w:bookmarkStart w:id="25" w:name="_Toc240736125"/>
+      <w:bookmarkStart w:id="25" w:name="_Toc240737919"/>
       <w:bookmarkEnd w:id="15"/>
       <w:r>
+        <w:lastRenderedPageBreak/>
         <w:t>3. Resultados</w:t>
       </w:r>
       <w:bookmarkEnd w:id="25"/>
@@ -7721,10 +7730,10 @@
         <w:t xml:space="preserve">Evaluación global de resultados: Todos los catorce resultados previstos en la lista de </w:t>
       </w:r>
       <w:r>
-        <w:t>comprobación de la Semana 05 fueron alcanzados satisfactoriamente sin observaciones pendientes. Las 3 encuestas que violaron la regla de suma 100 fueron descartadas y registradas con fines de auditoría metodológica, garantizando la pureza del diagnóstico c</w:t>
-      </w:r>
-      <w:r>
-        <w:t>ultural.</w:t>
+        <w:t>comprobación de la Semana 05 fueron alcanzados satisfactoriamente sin observaciones pendientes. Todo el código fuente, datasets, gráficos y matrices se encuentran versionados y verificables en el repositorio oficial de GitHub: https://github.com/Gianfranco</w:t>
+      </w:r>
+      <w:r>
+        <w:t>Arocutipa/Taller05_ArocutipaGIna/tree/taller-05.</w:t>
       </w:r>
     </w:p>
     <w:p>
@@ -7732,10 +7741,9 @@
         <w:pStyle w:val="Ttulo1"/>
       </w:pPr>
       <w:bookmarkStart w:id="26" w:name="conclusiones"/>
-      <w:bookmarkStart w:id="27" w:name="_Toc240736126"/>
+      <w:bookmarkStart w:id="27" w:name="_Toc240737920"/>
       <w:bookmarkEnd w:id="24"/>
       <w:r>
-        <w:lastRenderedPageBreak/>
         <w:t>4. Conclusiones</w:t>
       </w:r>
       <w:bookmarkEnd w:id="27"/>
@@ -7749,13 +7757,13 @@
       </w:r>
       <w:r>
         <w:br/>
-        <w:t xml:space="preserve">El diagnóstico demostró de forma concluyente que cuando los valores adoptados declarados (modernización, celeridad y servicio al vecino) colisionan con los supuestos </w:t>
-      </w:r>
-      <w:r>
-        <w:t>básicos subyacentes (el miedo al OCI, la necesidad de sellos físicos y la propiedad patrimonial de los datos), gobiernan indefectiblemente los supuestos. Un Plan Estratégico de TI que ignore esta tensión comete el error fatal de diseñar sistemas para una c</w:t>
-      </w:r>
-      <w:r>
-        <w:t>orporación idílica inexistente, garantizando el rechazo pasivo de los usuarios.</w:t>
+        <w:t xml:space="preserve">El diagnóstico demostró de forma concluyente que cuando los valores adoptados declarados (modernización, celeridad y servicio </w:t>
+      </w:r>
+      <w:r>
+        <w:t>al vecino) colisionan con los supuestos básicos subyacentes (el miedo al OCI, la necesidad de sellos físicos y la propiedad patrimonial de los datos), gobiernan indefectiblemente los supuestos. Un Plan Estratégico de TI que ignore esta tensión comete el er</w:t>
+      </w:r>
+      <w:r>
+        <w:t>ror fatal de diseñar sistemas para una corporación idílica inexistente, garantizando el rechazo pasivo de los usuarios.</w:t>
       </w:r>
       <w:r>
         <w:br/>
@@ -7766,16 +7774,16 @@
       </w:r>
       <w:r>
         <w:br/>
-        <w:t xml:space="preserve">El perfil cultural medido determina la metodología de presentación y la secuencia de implantación que </w:t>
-      </w:r>
-      <w:r>
-        <w:t>debe adoptarse para cada proyecto tecnológico. En una entidad con cultura dominante de Jerarquía (44.10 puntos) como la MPT, un proyecto como el Sistema de Gestión Documental Cero Papel no puede sostenerse únicamente en la 'innovación'; requiere previament</w:t>
-      </w:r>
-      <w:r>
-        <w:t>e resoluciones de Gerencia Municipal que otorguen pleno valor probatorio y blindaje legal a la firma digital. Asimismo, la divergencia entre gerencias exige presentar el plan con métricas de recaudación a Gestión Tributaria y con garantías de control a Adm</w:t>
-      </w:r>
-      <w:r>
-        <w:t>inistración.</w:t>
+        <w:t>El perfil cultural medido determina la metodología de presenta</w:t>
+      </w:r>
+      <w:r>
+        <w:t>ción y la secuencia de implantación que debe adoptarse para cada proyecto tecnológico. En una entidad con cultura dominante de Jerarquía (44.10 puntos) como la MPT, un proyecto como el Sistema de Gestión Documental Cero Papel no puede sostenerse únicamente</w:t>
+      </w:r>
+      <w:r>
+        <w:t xml:space="preserve"> en la 'innovación'; requiere previamente resoluciones de Gerencia Municipal que otorguen pleno valor probatorio y blindaje legal a la firma digital. Asimismo, la divergencia entre gerencias exige presentar el plan con métricas de recaudación a Gestión Tri</w:t>
+      </w:r>
+      <w:r>
+        <w:t>butaria y con garantías de control a Administración.</w:t>
       </w:r>
       <w:r>
         <w:br/>
@@ -7786,13 +7794,13 @@
       </w:r>
       <w:r>
         <w:br/>
-        <w:t>Un valor que no implica renunciar a nada no orienta ninguna decisión real ni resuelve conflictos operativos. Formular los valores organizacionales de la MPT co</w:t>
-      </w:r>
-      <w:r>
-        <w:t>mo conductas observables (cumplimiento vs violación), sanciones disciplinarias y renuncias deliberadas (renunciar a la discrecionalidad, al 'favor político' y al feudalismo de la información) es lo que los vuelve exigibles. Esto permite derivar políticas v</w:t>
-      </w:r>
-      <w:r>
-        <w:t>inculantes para el PETI, tales como la obligatoriedad de arquitecturas interoperables de estándares abiertos y la adopción de una cultura de reporte libre de culpa (Blameless Post-Mortem) en ciberseguridad.</w:t>
+        <w:t>Un valor que no implica renunciar a nada no orienta ninguna decisión real ni resuelve conflictos operativos. Formular l</w:t>
+      </w:r>
+      <w:r>
+        <w:t>os valores organizacionales de la MPT como conductas observables (cumplimiento vs violación), sanciones disciplinarias y renuncias deliberadas (renunciar a la discrecionalidad, al 'favor político' y al feudalismo de la información) es lo que los vuelve exi</w:t>
+      </w:r>
+      <w:r>
+        <w:t>gibles. Esto permite derivar políticas vinculantes para el PETI, tales como la obligatoriedad de arquitecturas interoperables de estándares abiertos y la adopción de una cultura de reporte libre de culpa (Blameless Post-Mortem) en ciberseguridad.</w:t>
       </w:r>
     </w:p>
     <w:p>
@@ -7800,10 +7808,13 @@
         <w:pStyle w:val="Ttulo1"/>
       </w:pPr>
       <w:bookmarkStart w:id="28" w:name="cuestionario"/>
-      <w:bookmarkStart w:id="29" w:name="_Toc240736127"/>
+      <w:bookmarkStart w:id="29" w:name="_Toc240737921"/>
       <w:bookmarkEnd w:id="26"/>
       <w:r>
-        <w:t>5. Cuestionario</w:t>
+        <w:t>5. Cuesti</w:t>
+      </w:r>
+      <w:r>
+        <w:t>onario</w:t>
       </w:r>
       <w:bookmarkEnd w:id="29"/>
     </w:p>
@@ -7812,10 +7823,7 @@
         <w:spacing w:after="160"/>
       </w:pPr>
       <w:r>
-        <w:t>Pregunta 1 (Pregunta de transfere</w:t>
-      </w:r>
-      <w:r>
-        <w:t>ncia de la guía · Paso G):</w:t>
+        <w:t>Pregunta 1 (Pregunta de transferencia de la guía · Paso G):</w:t>
       </w:r>
       <w:r>
         <w:br/>
@@ -7823,16 +7831,20 @@
       </w:r>
       <w:r>
         <w:br/>
-        <w:t>Respuesta: Correría el riesgo de invertir tiempo y presupuesto en soluciones tecnológicas que la organización terminará sabot</w:t>
-      </w:r>
-      <w:r>
-        <w:t xml:space="preserve">eando o subutilizando. En una institución pública como la Municipalidad Provincial de Tacna, omitir el diagnóstico significaría asumir erróneamente que el personal está listo para operar en un entorno digital ágil. En la práctica, al persistir el supuesto </w:t>
-      </w:r>
-      <w:r>
-        <w:t>arraigado de que 'la firma en papel es el único blindaje ante la Contraloría', los servidores imprimirían digitalizaciones para sellarlas manualmente, duplicando los tiempos de trámite y convirtiendo el sistema informático en un elefante blanco burocrático</w:t>
-      </w:r>
-      <w:r>
-        <w:t>.</w:t>
+        <w:t>Respuesta: Correría el riesgo de invertir tiempo y presupuesto en soluciones tecnológ</w:t>
+      </w:r>
+      <w:r>
+        <w:t xml:space="preserve">icas que la organización terminará saboteando o subutilizando. En una institución pública como la Municipalidad Provincial de Tacna, omitir el diagnóstico significaría asumir erróneamente que el </w:t>
+      </w:r>
+      <w:r>
+        <w:lastRenderedPageBreak/>
+        <w:t>personal está listo para operar en un entorno digital ágil. E</w:t>
+      </w:r>
+      <w:r>
+        <w:t>n la práctica, al persistir el supuesto arraigado de que 'la firma en papel es el único blindaje ante la Contraloría', los servidores imprimirían digitalizaciones para sellarlas manualmente, duplicando los tiempos de trámite y convirtiendo el sistema infor</w:t>
+      </w:r>
+      <w:r>
+        <w:t>mático en un elefante blanco burocrático.</w:t>
       </w:r>
       <w:r>
         <w:br/>
@@ -7847,13 +7859,13 @@
       </w:r>
       <w:r>
         <w:br/>
-        <w:t>Respuesta: Porque las escalas Likert tradicionales sufren de sesgo de deseabilidad social, permitiendo que el e</w:t>
-      </w:r>
-      <w:r>
-        <w:t>ncuestado califique todas las dimensiones como 'muy importantes', lo que oculta las tensiones reales de la organización. La suma forzada de 100 puntos obliga matemáticamente a elegir y priorizar entre valores en competencia (flexibilidad vs control, enfoqu</w:t>
-      </w:r>
-      <w:r>
-        <w:t>e interno vs externo), reflejando con exactitud los trade-offs de gestión que ocurren en la vida real de la entidad.</w:t>
+        <w:t>Respuesta: Porque las escalas Likert tradicionales sufren de sesgo de d</w:t>
+      </w:r>
+      <w:r>
+        <w:t>eseabilidad social, permitiendo que el encuestado califique todas las dimensiones como 'muy importantes', lo que oculta las tensiones reales de la organización. La suma forzada de 100 puntos obliga matemáticamente a elegir y priorizar entre valores en comp</w:t>
+      </w:r>
+      <w:r>
+        <w:t>etencia (flexibilidad vs control, enfoque interno vs externo), reflejando con exactitud los trade-offs de gestión que ocurren en la vida real de la entidad.</w:t>
       </w:r>
       <w:r>
         <w:br/>
@@ -7864,31 +7876,27 @@
       </w:r>
       <w:r>
         <w:br/>
-        <w:t xml:space="preserve">¿Cómo condiciona la cultura dominante de Jerarquía (44.10 pts) la implantación del Sistema de Gestión Documental y Expediente </w:t>
-      </w:r>
-      <w:r>
-        <w:t>Digital (SGD) en la MPT?</w:t>
+        <w:t>¿Cómo condiciona la cultura dominante de Jerarquía (44.10 pts) la implantación del Sis</w:t>
+      </w:r>
+      <w:r>
+        <w:t>tema de Gestión Documental y Expediente Digital (SGD) en la MPT?</w:t>
       </w:r>
       <w:r>
         <w:br/>
-        <w:t xml:space="preserve">Respuesta: Condiciona a que la implantación no puede ser un simple despliegue técnico de </w:t>
-      </w:r>
-      <w:r>
-        <w:lastRenderedPageBreak/>
-        <w:t>software, sino que debe estar precedida por un hito normativo de blindaje legal. Se requiere emitir Directivas Municipales aprobadas por Resol</w:t>
-      </w:r>
-      <w:r>
-        <w:t>ución de Gerencia Municipal y Decretos de Alcaldía que establezcan formalmente la equivalencia probatoria de la firma digital (RENIEC) frente a la firma manuscrita, eliminando el temor a responsabilidades ante el Órgano de Control Institucional (OCI).</w:t>
+        <w:t>Respuesta: Condiciona a que la implantación no puede ser un simple despliegue técnico de software, sino que debe estar precedida por un hito normativo de blindaje legal. Se requiere emitir Di</w:t>
+      </w:r>
+      <w:r>
+        <w:t>rectivas Municipales aprobadas por Resolución de Gerencia Municipal y Decretos de Alcaldía que establezcan formalmente la equivalencia probatoria de la firma digital (RENIEC) frente a la firma manuscrita, eliminando el temor a responsabilidades ante el Órg</w:t>
+      </w:r>
+      <w:r>
+        <w:t>ano de Control Institucional (OCI).</w:t>
       </w:r>
       <w:r>
         <w:br/>
       </w:r>
       <w:r>
         <w:br/>
-        <w:t>Pre</w:t>
-      </w:r>
-      <w:r>
-        <w:t>gunta 4:</w:t>
+        <w:t>Pregunta 4:</w:t>
       </w:r>
       <w:r>
         <w:br/>
@@ -7896,13 +7904,13 @@
       </w:r>
       <w:r>
         <w:br/>
-        <w:t>Respuesta: La renuncia explícita define el costo y el compromiso real de sostener el valor. Si un valor no declara a</w:t>
-      </w:r>
-      <w:r>
-        <w:t xml:space="preserve"> qué se renuncia, queda reducido a un lema propagandístico sin efecto normativo. Al explicitar que para sostener la 'Transparencia de Datos' se renuncia a que las gerencias retengan las bases de datos como cotos de poder, se habilita una política vinculant</w:t>
-      </w:r>
-      <w:r>
-        <w:t>e de TI: se prohíbe la compra de sistemas propietarios cerrados y se impone la interoperabilidad transversal obligatoria.</w:t>
+        <w:t>Respuesta: La renuncia explícita define el costo y el compromiso real de sos</w:t>
+      </w:r>
+      <w:r>
+        <w:t>tener el valor. Si un valor no declara a qué se renuncia, queda reducido a un lema propagandístico sin efecto normativo. Al explicitar que para sostener la 'Transparencia de Datos' se renuncia a que las gerencias retengan las bases de datos como cotos de p</w:t>
+      </w:r>
+      <w:r>
+        <w:t>oder, se habilita una política vinculante de TI: se prohíbe la compra de sistemas propietarios cerrados y se impone la interoperabilidad transversal obligatoria.</w:t>
       </w:r>
     </w:p>
     <w:p>
@@ -7910,7 +7918,7 @@
         <w:pStyle w:val="Ttulo1"/>
       </w:pPr>
       <w:bookmarkStart w:id="30" w:name="referencias-bibliográficas"/>
-      <w:bookmarkStart w:id="31" w:name="_Toc240736128"/>
+      <w:bookmarkStart w:id="31" w:name="_Toc240737922"/>
       <w:bookmarkEnd w:id="28"/>
       <w:r>
         <w:t>6. Referencias bibliográficas</w:t>
@@ -7922,10 +7930,10 @@
         <w:spacing w:after="160"/>
       </w:pPr>
       <w:r>
-        <w:t>Cameron, K. S. y Quinn, R. E. (2011). Diagnosing and Changing Organizational Culture: Based on the Compe</w:t>
-      </w:r>
-      <w:r>
-        <w:t>ting Values Framework (3.ª ed.). Jossey-Bass.</w:t>
+        <w:t>Cameron, K. S. y Quinn, R. E. (2011). Diagnosing and Changing Or</w:t>
+      </w:r>
+      <w:r>
+        <w:t>ganizational Culture: Based on the Competing Values Framework (3.ª ed.). Jossey-Bass.</w:t>
       </w:r>
       <w:r>
         <w:br/>
@@ -7939,10 +7947,10 @@
       </w:r>
       <w:r>
         <w:br/>
-        <w:t>Congreso de la República del Perú. (2003). Ley N° 27972: Ley Orgánica de Muni</w:t>
-      </w:r>
-      <w:r>
-        <w:t>cipalidades. Diario Oficial El Peruano.</w:t>
+        <w:t>Congreso de la República del Perú. (2</w:t>
+      </w:r>
+      <w:r>
+        <w:t>003). Ley N° 27972: Ley Orgánica de Municipalidades. Diario Oficial El Peruano.</w:t>
       </w:r>
       <w:r>
         <w:br/>
@@ -7956,27 +7964,31 @@
       </w:r>
       <w:r>
         <w:br/>
-        <w:t>González Millán, J. (2020). Manual práctico de planeación estratégic</w:t>
-      </w:r>
-      <w:r>
-        <w:t>a. Ediciones Díaz de Santos.</w:t>
+        <w:t xml:space="preserve">González Millán, J. (2020). </w:t>
+      </w:r>
+      <w:r>
+        <w:t>Manual práctico de planeación estratégica. Ediciones Díaz de Santos.</w:t>
       </w:r>
       <w:r>
         <w:br/>
       </w:r>
       <w:r>
         <w:br/>
-        <w:t>ISACA. (2018). COBIT 2019 Framework: Governance and Management Objectives (Componente «Cultura, Ética y Comportamiento»). Information Systems Audit and Control Association.</w:t>
+        <w:t xml:space="preserve">ISACA. (2018). COBIT 2019 Framework: Governance and Management Objectives (Componente «Cultura, Ética y Comportamiento»). Information Systems Audit and Control </w:t>
+      </w:r>
+      <w:r>
+        <w:lastRenderedPageBreak/>
+        <w:t>Association.</w:t>
       </w:r>
       <w:r>
         <w:br/>
       </w:r>
       <w:r>
         <w:br/>
-        <w:t>Kotter, J. P. (2012). Leading Change. Harvard Busine</w:t>
-      </w:r>
-      <w:r>
-        <w:t>ss Review Press.</w:t>
+        <w:t>Kotter, J. P</w:t>
+      </w:r>
+      <w:r>
+        <w:t>. (2012). Leading Change. Harvard Business Review Press.</w:t>
       </w:r>
       <w:r>
         <w:br/>
@@ -7990,10 +8002,10 @@
       </w:r>
       <w:r>
         <w:br/>
-        <w:t>Municipalidad Provincial de Tacna. (2022). Reglamento de Organización y Funciones (ROF 2022) y Organig</w:t>
-      </w:r>
-      <w:r>
-        <w:t>rama Estructural Institucional. MPT.</w:t>
+        <w:t>Municipalidad Provincial de Tacna. (2022). Reglamento de Organ</w:t>
+      </w:r>
+      <w:r>
+        <w:t>ización y Funciones (ROF 2022) y Organigrama Estructural Institucional. MPT.</w:t>
       </w:r>
       <w:r>
         <w:br/>
@@ -8007,10 +8019,10 @@
       </w:r>
       <w:r>
         <w:br/>
-        <w:t>Municipalidad Provincial de Tacna. (2025). Plan Estratégico Institucion</w:t>
-      </w:r>
-      <w:r>
-        <w:t>al de la Municipalidad Provincial de Tacna 2025-2030 (PEI 2025-2030). MPT.</w:t>
+        <w:t>Municipalidad Provincial de Tac</w:t>
+      </w:r>
+      <w:r>
+        <w:t>na. (2025). Plan Estratégico Institucional de la Municipalidad Provincial de Tacna 2025-2030 (PEI 2025-2030). MPT.</w:t>
       </w:r>
       <w:r>
         <w:br/>
@@ -8024,17 +8036,19 @@
       </w:r>
       <w:r>
         <w:br/>
-        <w:t>Schein, E. H. y Schein, P. (2017). Organizational Culture and Leadership (5.ª ed.). Wiley.</w:t>
+        <w:t>Schein, E. H. y Schein, P. (2017). Organizational Culture an</w:t>
+      </w:r>
+      <w:r>
+        <w:t>d Leadership (5.ª ed.). Wiley.</w:t>
       </w:r>
     </w:p>
     <w:p>
       <w:pPr>
         <w:pStyle w:val="Ttulo1"/>
       </w:pPr>
-      <w:bookmarkStart w:id="32" w:name="_Toc240736129"/>
+      <w:bookmarkStart w:id="32" w:name="_Toc240737923"/>
       <w:bookmarkEnd w:id="30"/>
       <w:r>
-        <w:lastRenderedPageBreak/>
         <w:t>7. Anexos</w:t>
       </w:r>
       <w:bookmarkEnd w:id="32"/>
@@ -8048,32 +8062,35 @@
       </w:r>
       <w:r>
         <w:br/>
-        <w:t>Archivo: anexos/anexo_A_instrumento_cvf.pdf (y .docx)</w:t>
+        <w:t>Archivo: anexos/anexo_A_instrumento_cvf.pdf (y .docx) | URL: https://github.com/GianfrancoArocutipa/Taller05_ArocutipaGIna/tree/tall</w:t>
+      </w:r>
+      <w:r>
+        <w:t>er-05/anexos/anexo_A_instrumento_cvf.pdf</w:t>
       </w:r>
       <w:r>
         <w:br/>
-        <w:t xml:space="preserve">Descripción: Cuestionario completo de seis dimensiones, con las cuatro afirmaciones contextualizadas a la corporación </w:t>
-      </w:r>
-      <w:r>
-        <w:t>edil, regla de suma 100 e instrucciones metodológicas.</w:t>
+        <w:t>Descripción: Cuestionario completo de seis dimensiones, con las cuatro afirmaciones contextualizadas a la corporación edil, regla de suma 100 e instrucciones metodológicas.</w:t>
       </w:r>
       <w:r>
         <w:br/>
       </w:r>
       <w:r>
         <w:br/>
-        <w:t>Anexo B: Matriz Consolidada de Resultados de Cultura Organizacional</w:t>
+        <w:t>Anexo B: Matriz Consolidada de Resultados</w:t>
+      </w:r>
+      <w:r>
+        <w:t xml:space="preserve"> de Cultura Organizacional</w:t>
       </w:r>
       <w:r>
         <w:br/>
-        <w:t>Archivo: anexos/anexo_B_resultados_cultura.xlsx</w:t>
+        <w:t>Archivo: anexos/anexo_B_resultados_cultura.xlsx | URL: https://github.com/GianfrancoArocutipa/Taller05_ArocutipaGIna/tree/taller-05/anexos/anexo_B_resultados_cultura.xlsx</w:t>
       </w:r>
       <w:r>
         <w:br/>
-        <w:t>Descripción: Libro en formato Microsoft Excel con las 32 encuestas conformes depurad</w:t>
-      </w:r>
-      <w:r>
-        <w:t>as y las hojas de promedios, brechas dimensionales y datos del radar.</w:t>
+        <w:t>Descripción: Libro en formato Microsoft Excel con las 32 e</w:t>
+      </w:r>
+      <w:r>
+        <w:t>ncuestas conformes depuradas y las hojas de promedios, brechas dimensionales y datos del radar.</w:t>
       </w:r>
       <w:r>
         <w:br/>
@@ -8084,32 +8101,35 @@
       </w:r>
       <w:r>
         <w:br/>
-        <w:t>Archivo: anexos/anexo_C_perfil_cultura.png</w:t>
+        <w:t>Archivo: anexos/anexo_C_perfil_cultura.png | URL: https://github.com/GianfrancoArocutipa/Taller</w:t>
+      </w:r>
+      <w:r>
+        <w:t>05_ArocutipaGIna/tree/taller-05/anexos/anexo_C_perfil_cultura.png</w:t>
       </w:r>
       <w:r>
         <w:br/>
-        <w:t>Descripción: Imagen renderizada a 300 DPI que ilustra el contraste polar entre</w:t>
-      </w:r>
-      <w:r>
-        <w:t xml:space="preserve"> la cultura Actual (Jerarquía dominante) y la cultura Deseada al 2030 (Adhocracia).</w:t>
+        <w:t>Descripción: Imagen renderizada a 300 DPI que ilustra el contraste polar entre la cultura Actual (Jerarquía dominante) y la cultura Deseada al 2030 (Adhocracia).</w:t>
       </w:r>
       <w:r>
         <w:br/>
       </w:r>
       <w:r>
         <w:br/>
-        <w:t>Anexo D: Matriz de Supuestos Básicos e Inferencias de la MPT</w:t>
+        <w:t>Anexo D: Matriz de Supuesto</w:t>
+      </w:r>
+      <w:r>
+        <w:t>s Básicos e Inferencias de la MPT</w:t>
       </w:r>
       <w:r>
         <w:br/>
-        <w:t>Archivo: anexos/anexo_D_supuestos_basicos.xlsx</w:t>
+        <w:t>Archivo: anexos/anexo_D_supuestos_basicos.xlsx | URL: https://github.com/GianfrancoArocutipa/Taller05_ArocutipaGIna/tree/taller-05/anexos/anexo_D_supuestos_basicos.xlsx</w:t>
       </w:r>
       <w:r>
         <w:br/>
-        <w:t>Descripción: Matriz en Excel estructurada con los seis supuesto</w:t>
-      </w:r>
-      <w:r>
-        <w:t>s básicos inferidos a partir del ROF 2022, RISST 2024 y PEI 2025-2030, detallando las brechas observadas.</w:t>
+        <w:t>Descripción: Matriz en Excel estructurada con los sei</w:t>
+      </w:r>
+      <w:r>
+        <w:t>s supuestos básicos inferidos a partir del ROF 2022, RISST 2024 y PEI 2025-2030, detallando las brechas observadas.</w:t>
       </w:r>
       <w:r>
         <w:br/>
@@ -8120,14 +8140,20 @@
       </w:r>
       <w:r>
         <w:br/>
-        <w:t>Archivo: anexos/anexo_E_secciones_2_3_2_4.pdf (y .docx)</w:t>
+        <w:t>Archivo: anexos/anexo_E_secciones_2_3_2_4.pdf (y .docx) | URL: https://github.com</w:t>
+      </w:r>
+      <w:r>
+        <w:t>/GianfrancoArocutipa/Taller05_ArocutipaGIna/tree/taller-05/anexos/anexo_E_secciones_2_3_2_4.pdf</w:t>
       </w:r>
       <w:r>
         <w:br/>
-        <w:t xml:space="preserve">Descripción: Texto normativo final </w:t>
-      </w:r>
-      <w:r>
-        <w:t>aprobado de la Sección 2.3 (Valores institucionales y tecnológicos) y Sección 2.4 (Diagnóstico cultural), versionado bajo la etiqueta v0.5.</w:t>
+      </w:r>
+      <w:r>
+        <w:lastRenderedPageBreak/>
+        <w:t xml:space="preserve">Descripción: Texto normativo final aprobado de la Sección 2.3 (Valores institucionales y tecnológicos) y Sección 2.4 (Diagnóstico cultural), versionado bajo la </w:t>
+      </w:r>
+      <w:r>
+        <w:t>etiqueta v0.5.</w:t>
       </w:r>
     </w:p>
     <w:sectPr>
@@ -8266,7 +8292,7 @@
         <w:noProof/>
       </w:rPr>
       <w:drawing>
-        <wp:inline distT="0" distB="0" distL="0" distR="0" wp14:anchorId="31BBB31B" wp14:editId="08D2D5F3">
+        <wp:inline distT="0" distB="0" distL="0" distR="0" wp14:anchorId="141FA1F5" wp14:editId="1C94EBC1">
           <wp:extent cx="502920" cy="502920"/>
           <wp:effectExtent l="0" t="0" r="0" b="0"/>
           <wp:docPr id="1" name="Imagen 1" descr="Logotipo de la Universidad Privada de Tacna"/>

</xml_diff>